<commit_message>
Paper B: fill C2 repo URL (github.com/exergyleizhou-ux/ropfec), C1 v1.0.0; C3 Zenodo in progress
</commit_message>
<xml_diff>
--- a/paper/softwarex.docx
+++ b/paper/softwarex.docx
@@ -350,7 +350,7 @@
         <w:t xml:space="preserve">polytope; metabolic control analysis; optimal control; staged bioconversion; falsification</w:t>
       </w:r>
     </w:p>
-    <w:bookmarkStart w:id="11" w:name="tab:meta"/>
+    <w:bookmarkStart w:id="12" w:name="tab:meta"/>
     <w:p>
       <w:pPr>
         <w:pStyle w:val="TableCaption"/>
@@ -435,7 +435,7 @@
               <w:t xml:space="preserve"> </w:t>
             </w:r>
             <w:r>
-              <w:t xml:space="preserve">v1.0</w:t>
+              <w:t xml:space="preserve">v1.0.0</w:t>
             </w:r>
           </w:p>
         </w:tc>
@@ -463,13 +463,14 @@
             <w:r>
               <w:t xml:space="preserve"> </w:t>
             </w:r>
-            <w:r>
-              <w:rPr>
-                <w:i/>
-                <w:iCs/>
-              </w:rPr>
-              <w:t xml:space="preserve">to be finalized at posting (GitHub)</w:t>
-            </w:r>
+            <w:hyperlink r:id="rId11">
+              <w:r>
+                <w:rPr>
+                  <w:rStyle w:val="Hyperlink"/>
+                </w:rPr>
+                <w:t xml:space="preserve">https://github.com/exergyleizhou-ux/ropfec</w:t>
+              </w:r>
+            </w:hyperlink>
           </w:p>
         </w:tc>
       </w:tr>
@@ -497,11 +498,17 @@
               <w:t xml:space="preserve"> </w:t>
             </w:r>
             <w:r>
+              <w:t xml:space="preserve">Zenodo DOI minted from the v1.0.0 release</w:t>
+            </w:r>
+            <w:r>
+              <w:t xml:space="preserve"> </w:t>
+            </w:r>
+            <w:r>
               <w:rPr>
                 <w:i/>
                 <w:iCs/>
               </w:rPr>
-              <w:t xml:space="preserve">to be finalized at posting (Zenodo DOI)</w:t>
+              <w:t xml:space="preserve">(in progress)</w:t>
             </w:r>
           </w:p>
         </w:tc>
@@ -712,8 +719,8 @@
         </w:tc>
       </w:tr>
     </w:tbl>
-    <w:bookmarkEnd w:id="11"/>
-    <w:bookmarkStart w:id="12" w:name="motivation-and-significance"/>
+    <w:bookmarkEnd w:id="12"/>
+    <w:bookmarkStart w:id="13" w:name="motivation-and-significance"/>
     <w:p>
       <w:pPr>
         <w:pStyle w:val="Heading1"/>
@@ -1200,8 +1207,8 @@
         <w:t xml:space="preserve">software contribution this scope is the point, not a limitation.</w:t>
       </w:r>
     </w:p>
-    <w:bookmarkEnd w:id="12"/>
-    <w:bookmarkStart w:id="20" w:name="sec:desc"/>
+    <w:bookmarkEnd w:id="13"/>
+    <w:bookmarkStart w:id="21" w:name="sec:desc"/>
     <w:p>
       <w:pPr>
         <w:pStyle w:val="Heading1"/>
@@ -1210,7 +1217,7 @@
         <w:t xml:space="preserve">Software description</w:t>
       </w:r>
     </w:p>
-    <w:bookmarkStart w:id="14" w:name="software-architecture"/>
+    <w:bookmarkStart w:id="15" w:name="software-architecture"/>
     <w:p>
       <w:pPr>
         <w:pStyle w:val="Heading2"/>
@@ -1964,7 +1971,7 @@
         <w:t xml:space="preserve">.</w:t>
       </w:r>
     </w:p>
-    <w:bookmarkStart w:id="13" w:name="Xb776dee7cc28cd212113461d100a97d65f11c29"/>
+    <w:bookmarkStart w:id="14" w:name="Xb776dee7cc28cd212113461d100a97d65f11c29"/>
     <w:p>
       <w:pPr>
         <w:pStyle w:val="Heading4"/>
@@ -2289,9 +2296,9 @@
         <w:t xml:space="preserve">of FEC’s control variable is the small clarifying point, not a theorem.</w:t>
       </w:r>
     </w:p>
-    <w:bookmarkEnd w:id="13"/>
     <w:bookmarkEnd w:id="14"/>
-    <w:bookmarkStart w:id="19" w:name="software-functionalities"/>
+    <w:bookmarkEnd w:id="15"/>
+    <w:bookmarkStart w:id="20" w:name="software-functionalities"/>
     <w:p>
       <w:pPr>
         <w:pStyle w:val="Heading2"/>
@@ -2792,7 +2799,7 @@
         <w:t xml:space="preserve">  PYTHONPATH=. python3 paper/make_softwarex_figs.py # regenerate the data figures + numbers</w:t>
       </w:r>
     </w:p>
-    <w:bookmarkStart w:id="18" w:name="fig:arch"/>
+    <w:bookmarkStart w:id="19" w:name="fig:arch"/>
     <w:p>
       <w:pPr>
         <w:pStyle w:val="CaptionedFigure"/>
@@ -2802,18 +2809,18 @@
           <wp:inline>
             <wp:extent cx="5334000" cy="1398721"/>
             <wp:effectExtent b="0" l="0" r="0" t="0"/>
-            <wp:docPr descr="" title="" id="16" name="Picture"/>
+            <wp:docPr descr="" title="" id="17" name="Picture"/>
             <a:graphic>
               <a:graphicData uri="http://schemas.openxmlformats.org/drawingml/2006/picture">
                 <pic:pic>
                   <pic:nvPicPr>
-                    <pic:cNvPr descr="figures/ropfec_architecture.png" id="17" name="Picture"/>
+                    <pic:cNvPr descr="figures/ropfec_architecture.png" id="18" name="Picture"/>
                     <pic:cNvPicPr>
                       <a:picLocks noChangeArrowheads="1" noChangeAspect="1"/>
                     </pic:cNvPicPr>
                   </pic:nvPicPr>
                   <pic:blipFill>
-                    <a:blip r:embed="rId15"/>
+                    <a:blip r:embed="rId16"/>
                     <a:stretch>
                       <a:fillRect/>
                     </a:stretch>
@@ -2956,10 +2963,10 @@
         <w:t xml:space="preserve">exponent geometry.</w:t>
       </w:r>
     </w:p>
-    <w:bookmarkEnd w:id="18"/>
     <w:bookmarkEnd w:id="19"/>
     <w:bookmarkEnd w:id="20"/>
-    <w:bookmarkStart w:id="36" w:name="sec:examples"/>
+    <w:bookmarkEnd w:id="21"/>
+    <w:bookmarkStart w:id="37" w:name="sec:examples"/>
     <w:p>
       <w:pPr>
         <w:pStyle w:val="Heading1"/>
@@ -2982,7 +2989,7 @@
         <w:t xml:space="preserve">to a script in the repository.</w:t>
       </w:r>
     </w:p>
-    <w:bookmarkStart w:id="25" w:name="X300f97475038c434fb1165f11f0c339bee37779"/>
+    <w:bookmarkStart w:id="26" w:name="X300f97475038c434fb1165f11f0c339bee37779"/>
     <w:p>
       <w:pPr>
         <w:pStyle w:val="Heading4"/>
@@ -3215,7 +3222,7 @@
         <w:t xml:space="preserve">synthetic-trajectory error, not empirical accuracy on biological data.</w:t>
       </w:r>
     </w:p>
-    <w:bookmarkStart w:id="24" w:name="fig:toy"/>
+    <w:bookmarkStart w:id="25" w:name="fig:toy"/>
     <w:p>
       <w:pPr>
         <w:pStyle w:val="CaptionedFigure"/>
@@ -3225,18 +3232,18 @@
           <wp:inline>
             <wp:extent cx="4319999" cy="2829164"/>
             <wp:effectExtent b="0" l="0" r="0" t="0"/>
-            <wp:docPr descr="" title="" id="22" name="Picture"/>
+            <wp:docPr descr="" title="" id="23" name="Picture"/>
             <a:graphic>
               <a:graphicData uri="http://schemas.openxmlformats.org/drawingml/2006/picture">
                 <pic:pic>
                   <pic:nvPicPr>
-                    <pic:cNvPr descr="figures/toy_traj_comparison.png" id="23" name="Picture"/>
+                    <pic:cNvPr descr="figures/toy_traj_comparison.png" id="24" name="Picture"/>
                     <pic:cNvPicPr>
                       <a:picLocks noChangeArrowheads="1" noChangeAspect="1"/>
                     </pic:cNvPicPr>
                   </pic:nvPicPr>
                   <pic:blipFill>
-                    <a:blip r:embed="rId21"/>
+                    <a:blip r:embed="rId22"/>
                     <a:stretch>
                       <a:fillRect/>
                     </a:stretch>
@@ -3330,9 +3337,9 @@
         <w:t xml:space="preserve">). Synthetic ground truth; not a biological benchmark.</w:t>
       </w:r>
     </w:p>
-    <w:bookmarkEnd w:id="24"/>
     <w:bookmarkEnd w:id="25"/>
-    <w:bookmarkStart w:id="30" w:name="validated-oscillator-testbeds."/>
+    <w:bookmarkEnd w:id="26"/>
+    <w:bookmarkStart w:id="31" w:name="validated-oscillator-testbeds."/>
     <w:p>
       <w:pPr>
         <w:pStyle w:val="Heading4"/>
@@ -3379,7 +3386,7 @@
         <w:t xml:space="preserve">the toy network.</w:t>
       </w:r>
     </w:p>
-    <w:bookmarkStart w:id="29" w:name="fig:osc"/>
+    <w:bookmarkStart w:id="30" w:name="fig:osc"/>
     <w:p>
       <w:pPr>
         <w:pStyle w:val="CaptionedFigure"/>
@@ -3389,18 +3396,18 @@
           <wp:inline>
             <wp:extent cx="5334000" cy="2585318"/>
             <wp:effectExtent b="0" l="0" r="0" t="0"/>
-            <wp:docPr descr="" title="" id="27" name="Picture"/>
+            <wp:docPr descr="" title="" id="28" name="Picture"/>
             <a:graphic>
               <a:graphicData uri="http://schemas.openxmlformats.org/drawingml/2006/picture">
                 <pic:pic>
                   <pic:nvPicPr>
-                    <pic:cNvPr descr="figures/case_studies_oscillations.png" id="28" name="Picture"/>
+                    <pic:cNvPr descr="figures/case_studies_oscillations.png" id="29" name="Picture"/>
                     <pic:cNvPicPr>
                       <a:picLocks noChangeArrowheads="1" noChangeAspect="1"/>
                     </pic:cNvPicPr>
                   </pic:nvPicPr>
                   <pic:blipFill>
-                    <a:blip r:embed="rId26"/>
+                    <a:blip r:embed="rId27"/>
                     <a:stretch>
                       <a:fillRect/>
                     </a:stretch>
@@ -3457,9 +3464,9 @@
         <w:t xml:space="preserve">core (sustained oscillation of an ATP-like cofactor). Tested against the published dynamics.</w:t>
       </w:r>
     </w:p>
-    <w:bookmarkEnd w:id="29"/>
     <w:bookmarkEnd w:id="30"/>
-    <w:bookmarkStart w:id="35" w:name="Xda4e20b13a6ccba0613190cd745101d4718570e"/>
+    <w:bookmarkEnd w:id="31"/>
+    <w:bookmarkStart w:id="36" w:name="Xda4e20b13a6ccba0613190cd745101d4718570e"/>
     <w:p>
       <w:pPr>
         <w:pStyle w:val="Heading4"/>
@@ -3792,7 +3799,7 @@
         <w:t xml:space="preserve">multicellular policy rejects every over-capacity configuration in the test suite by its admission threshold.</w:t>
       </w:r>
     </w:p>
-    <w:bookmarkStart w:id="34" w:name="fig:neg"/>
+    <w:bookmarkStart w:id="35" w:name="fig:neg"/>
     <w:p>
       <w:pPr>
         <w:pStyle w:val="CaptionedFigure"/>
@@ -3802,18 +3809,18 @@
           <wp:inline>
             <wp:extent cx="4319999" cy="2456086"/>
             <wp:effectExtent b="0" l="0" r="0" t="0"/>
-            <wp:docPr descr="" title="" id="32" name="Picture"/>
+            <wp:docPr descr="" title="" id="33" name="Picture"/>
             <a:graphic>
               <a:graphicData uri="http://schemas.openxmlformats.org/drawingml/2006/picture">
                 <pic:pic>
                   <pic:nvPicPr>
-                    <pic:cNvPr descr="figures/order_uq_negative.png" id="33" name="Picture"/>
+                    <pic:cNvPr descr="figures/order_uq_negative.png" id="34" name="Picture"/>
                     <pic:cNvPicPr>
                       <a:picLocks noChangeArrowheads="1" noChangeAspect="1"/>
                     </pic:cNvPicPr>
                   </pic:nvPicPr>
                   <pic:blipFill>
-                    <a:blip r:embed="rId31"/>
+                    <a:blip r:embed="rId32"/>
                     <a:stretch>
                       <a:fillRect/>
                     </a:stretch>
@@ -3904,10 +3911,10 @@
         <w:t xml:space="preserve">inactive; when data are scarce it is no better than chance. Shipped as a re-runnable test.</w:t>
       </w:r>
     </w:p>
-    <w:bookmarkEnd w:id="34"/>
     <w:bookmarkEnd w:id="35"/>
     <w:bookmarkEnd w:id="36"/>
-    <w:bookmarkStart w:id="37" w:name="impact"/>
+    <w:bookmarkEnd w:id="37"/>
+    <w:bookmarkStart w:id="38" w:name="impact"/>
     <w:p>
       <w:pPr>
         <w:pStyle w:val="Heading1"/>
@@ -4107,8 +4114,8 @@
         <w:t xml:space="preserve">separately.</w:t>
       </w:r>
     </w:p>
-    <w:bookmarkEnd w:id="37"/>
-    <w:bookmarkStart w:id="38" w:name="conclusions"/>
+    <w:bookmarkEnd w:id="38"/>
+    <w:bookmarkStart w:id="39" w:name="conclusions"/>
     <w:p>
       <w:pPr>
         <w:pStyle w:val="Heading1"/>
@@ -4214,8 +4221,8 @@
         <w:t xml:space="preserve">.</w:t>
       </w:r>
     </w:p>
-    <w:bookmarkEnd w:id="38"/>
-    <w:bookmarkStart w:id="43" w:name="declarations"/>
+    <w:bookmarkEnd w:id="39"/>
+    <w:bookmarkStart w:id="44" w:name="declarations"/>
     <w:p>
       <w:pPr>
         <w:pStyle w:val="Heading1"/>
@@ -4224,7 +4231,7 @@
         <w:t xml:space="preserve">Declarations</w:t>
       </w:r>
     </w:p>
-    <w:bookmarkStart w:id="39" w:name="code-and-data-availability."/>
+    <w:bookmarkStart w:id="40" w:name="code-and-data-availability."/>
     <w:p>
       <w:pPr>
         <w:pStyle w:val="Heading4"/>
@@ -4268,8 +4275,8 @@
         <w:t xml:space="preserve">archived with a DOI on Zenodo upon posting (Table 1).</w:t>
       </w:r>
     </w:p>
-    <w:bookmarkEnd w:id="39"/>
-    <w:bookmarkStart w:id="40" w:name="use-of-generative-ai."/>
+    <w:bookmarkEnd w:id="40"/>
+    <w:bookmarkStart w:id="41" w:name="use-of-generative-ai."/>
     <w:p>
       <w:pPr>
         <w:pStyle w:val="Heading4"/>
@@ -4298,8 +4305,8 @@
         <w:t xml:space="preserve">quantitative claim and citation, and reproduced all reported numbers from the released code.</w:t>
       </w:r>
     </w:p>
-    <w:bookmarkEnd w:id="40"/>
-    <w:bookmarkStart w:id="41" w:name="competing-interests."/>
+    <w:bookmarkEnd w:id="41"/>
+    <w:bookmarkStart w:id="42" w:name="competing-interests."/>
     <w:p>
       <w:pPr>
         <w:pStyle w:val="Heading4"/>
@@ -4316,8 +4323,8 @@
         <w:t xml:space="preserve">The author declares no competing interests.</w:t>
       </w:r>
     </w:p>
-    <w:bookmarkEnd w:id="41"/>
-    <w:bookmarkStart w:id="42" w:name="funding."/>
+    <w:bookmarkEnd w:id="42"/>
+    <w:bookmarkStart w:id="43" w:name="funding."/>
     <w:p>
       <w:pPr>
         <w:pStyle w:val="Heading4"/>
@@ -4340,9 +4347,9 @@
         <w:t xml:space="preserve">public, commercial, or not-for-profit sectors.</w:t>
       </w:r>
     </w:p>
-    <w:bookmarkEnd w:id="42"/>
     <w:bookmarkEnd w:id="43"/>
-    <w:bookmarkStart w:id="44" w:name="acknowledgements"/>
+    <w:bookmarkEnd w:id="44"/>
+    <w:bookmarkStart w:id="45" w:name="acknowledgements"/>
     <w:p>
       <w:pPr>
         <w:pStyle w:val="Heading1"/>
@@ -4365,8 +4372,8 @@
         <w:t xml:space="preserve">framework of Fangzhou Xiao, Jing Shuang Li, and John C. Doyle.</w:t>
       </w:r>
     </w:p>
-    <w:bookmarkEnd w:id="44"/>
-    <w:bookmarkStart w:id="97" w:name="references"/>
+    <w:bookmarkEnd w:id="45"/>
+    <w:bookmarkStart w:id="98" w:name="references"/>
     <w:p>
       <w:pPr>
         <w:pStyle w:val="Heading1"/>
@@ -4375,8 +4382,8 @@
         <w:t xml:space="preserve">References</w:t>
       </w:r>
     </w:p>
-    <w:bookmarkStart w:id="96" w:name="refs"/>
-    <w:bookmarkStart w:id="46" w:name="ref-orth2010fba"/>
+    <w:bookmarkStart w:id="97" w:name="refs"/>
+    <w:bookmarkStart w:id="47" w:name="ref-orth2010fba"/>
     <w:p>
       <w:pPr>
         <w:pStyle w:val="Bibliography"/>
@@ -4393,7 +4400,7 @@
       <w:r>
         <w:t xml:space="preserve">Orth, J. D., Thiele, I., and Palsson, B. Ø. What is flux balance analysis? Nature Biotechnology, 2010;28:245–248. doi:</w:t>
       </w:r>
-      <w:hyperlink r:id="rId45">
+      <w:hyperlink r:id="rId46">
         <w:r>
           <w:rPr>
             <w:rStyle w:val="Hyperlink"/>
@@ -4402,8 +4409,8 @@
         </w:r>
       </w:hyperlink>
     </w:p>
-    <w:bookmarkEnd w:id="46"/>
-    <w:bookmarkStart w:id="48" w:name="ref-varma1994stoichiometric"/>
+    <w:bookmarkEnd w:id="47"/>
+    <w:bookmarkStart w:id="49" w:name="ref-varma1994stoichiometric"/>
     <w:p>
       <w:pPr>
         <w:pStyle w:val="Bibliography"/>
@@ -4435,7 +4442,7 @@
       <w:r>
         <w:t xml:space="preserve">. Applied and Environmental Microbiology, 1994;60:3724–3731. doi:</w:t>
       </w:r>
-      <w:hyperlink r:id="rId47">
+      <w:hyperlink r:id="rId48">
         <w:r>
           <w:rPr>
             <w:rStyle w:val="Hyperlink"/>
@@ -4444,8 +4451,8 @@
         </w:r>
       </w:hyperlink>
     </w:p>
-    <w:bookmarkEnd w:id="48"/>
-    <w:bookmarkStart w:id="50" w:name="ref-saa2017kinetic"/>
+    <w:bookmarkEnd w:id="49"/>
+    <w:bookmarkStart w:id="51" w:name="ref-saa2017kinetic"/>
     <w:p>
       <w:pPr>
         <w:pStyle w:val="Bibliography"/>
@@ -4462,7 +4469,7 @@
       <w:r>
         <w:t xml:space="preserve">Saa, P. A., and Nielsen, L. K. Formulation, construction and analysis of kinetic models of metabolism: A review of modelling frameworks. Biotechnology Advances, 2017;35:981–1003. doi:</w:t>
       </w:r>
-      <w:hyperlink r:id="rId49">
+      <w:hyperlink r:id="rId50">
         <w:r>
           <w:rPr>
             <w:rStyle w:val="Hyperlink"/>
@@ -4471,8 +4478,8 @@
         </w:r>
       </w:hyperlink>
     </w:p>
-    <w:bookmarkEnd w:id="50"/>
-    <w:bookmarkStart w:id="52" w:name="ref-mahadevan2002dfba"/>
+    <w:bookmarkEnd w:id="51"/>
+    <w:bookmarkStart w:id="53" w:name="ref-mahadevan2002dfba"/>
     <w:p>
       <w:pPr>
         <w:pStyle w:val="Bibliography"/>
@@ -4498,7 +4505,7 @@
       <w:r>
         <w:t xml:space="preserve">. Biophysical Journal, 2002;83:1331–1340. doi:</w:t>
       </w:r>
-      <w:hyperlink r:id="rId51">
+      <w:hyperlink r:id="rId52">
         <w:r>
           <w:rPr>
             <w:rStyle w:val="Hyperlink"/>
@@ -4507,8 +4514,8 @@
         </w:r>
       </w:hyperlink>
     </w:p>
-    <w:bookmarkEnd w:id="52"/>
-    <w:bookmarkStart w:id="54" w:name="ref-hatzimanikatis1997loglinear"/>
+    <w:bookmarkEnd w:id="53"/>
+    <w:bookmarkStart w:id="55" w:name="ref-hatzimanikatis1997loglinear"/>
     <w:p>
       <w:pPr>
         <w:pStyle w:val="Bibliography"/>
@@ -4525,7 +4532,7 @@
       <w:r>
         <w:t xml:space="preserve">Hatzimanikatis, V., and Bailey, J. E. Effects of spatiotemporal variations on metabolic control: Approximate analysis using (log)linear kinetic models. Biotechnology and Bioengineering, 1997;54:91–104. doi:</w:t>
       </w:r>
-      <w:hyperlink r:id="rId53">
+      <w:hyperlink r:id="rId54">
         <w:r>
           <w:rPr>
             <w:rStyle w:val="Hyperlink"/>
@@ -4534,8 +4541,8 @@
         </w:r>
       </w:hyperlink>
     </w:p>
-    <w:bookmarkEnd w:id="54"/>
-    <w:bookmarkStart w:id="56" w:name="ref-visser2003linlog"/>
+    <w:bookmarkEnd w:id="55"/>
+    <w:bookmarkStart w:id="57" w:name="ref-visser2003linlog"/>
     <w:p>
       <w:pPr>
         <w:pStyle w:val="Bibliography"/>
@@ -4552,7 +4559,7 @@
       <w:r>
         <w:t xml:space="preserve">Visser, D., and Heijnen, J. J. Dynamic simulation and metabolic re-design of a branched pathway using linlog kinetics. Metabolic Engineering, 2003;5:164–176. doi:</w:t>
       </w:r>
-      <w:hyperlink r:id="rId55">
+      <w:hyperlink r:id="rId56">
         <w:r>
           <w:rPr>
             <w:rStyle w:val="Hyperlink"/>
@@ -4561,8 +4568,8 @@
         </w:r>
       </w:hyperlink>
     </w:p>
-    <w:bookmarkEnd w:id="56"/>
-    <w:bookmarkStart w:id="58" w:name="ref-miskovic2010oracle"/>
+    <w:bookmarkEnd w:id="57"/>
+    <w:bookmarkStart w:id="59" w:name="ref-miskovic2010oracle"/>
     <w:p>
       <w:pPr>
         <w:pStyle w:val="Bibliography"/>
@@ -4588,7 +4595,7 @@
       <w:r>
         <w:t xml:space="preserve">. Trends in Biotechnology, 2010;28:391–397. doi:</w:t>
       </w:r>
-      <w:hyperlink r:id="rId57">
+      <w:hyperlink r:id="rId58">
         <w:r>
           <w:rPr>
             <w:rStyle w:val="Hyperlink"/>
@@ -4597,8 +4604,8 @@
         </w:r>
       </w:hyperlink>
     </w:p>
-    <w:bookmarkEnd w:id="58"/>
-    <w:bookmarkStart w:id="60" w:name="ref-smallbone2007bridging"/>
+    <w:bookmarkEnd w:id="59"/>
+    <w:bookmarkStart w:id="61" w:name="ref-smallbone2007bridging"/>
     <w:p>
       <w:pPr>
         <w:pStyle w:val="Bibliography"/>
@@ -4615,7 +4622,7 @@
       <w:r>
         <w:t xml:space="preserve">Smallbone, K., Simeonidis, E., Broomhead, D. S., and Kell, D. B. Something from nothing: Bridging the gap between constraint-based and kinetic modelling. The FEBS Journal, 2007;274:5576–5585. doi:</w:t>
       </w:r>
-      <w:hyperlink r:id="rId59">
+      <w:hyperlink r:id="rId60">
         <w:r>
           <w:rPr>
             <w:rStyle w:val="Hyperlink"/>
@@ -4624,8 +4631,8 @@
         </w:r>
       </w:hyperlink>
     </w:p>
-    <w:bookmarkEnd w:id="60"/>
-    <w:bookmarkStart w:id="62" w:name="ref-xiao2023fec"/>
+    <w:bookmarkEnd w:id="61"/>
+    <w:bookmarkStart w:id="63" w:name="ref-xiao2023fec"/>
     <w:p>
       <w:pPr>
         <w:pStyle w:val="Bibliography"/>
@@ -4642,7 +4649,7 @@
       <w:r>
         <w:t xml:space="preserve">Xiao, F., Li, J. S., and Doyle, J. C. Flux exponent control predicts metabolic dynamics from network structure. 2023 american control conference (ACC), 2023;1189–1194. doi:</w:t>
       </w:r>
-      <w:hyperlink r:id="rId61">
+      <w:hyperlink r:id="rId62">
         <w:r>
           <w:rPr>
             <w:rStyle w:val="Hyperlink"/>
@@ -4651,8 +4658,8 @@
         </w:r>
       </w:hyperlink>
     </w:p>
-    <w:bookmarkEnd w:id="62"/>
-    <w:bookmarkStart w:id="64" w:name="ref-xiao2022thesis"/>
+    <w:bookmarkEnd w:id="63"/>
+    <w:bookmarkStart w:id="65" w:name="ref-xiao2022thesis"/>
     <w:p>
       <w:pPr>
         <w:pStyle w:val="Bibliography"/>
@@ -4669,7 +4676,7 @@
       <w:r>
         <w:t xml:space="preserve">Xiao, F. Biocontrol of biomolecular systems: Polyhedral constraints on binding’s regulation of catalysis from biocircuits to metabolism. California Institute of Technology, 2022. doi:</w:t>
       </w:r>
-      <w:hyperlink r:id="rId63">
+      <w:hyperlink r:id="rId64">
         <w:r>
           <w:rPr>
             <w:rStyle w:val="Hyperlink"/>
@@ -4678,8 +4685,8 @@
         </w:r>
       </w:hyperlink>
     </w:p>
-    <w:bookmarkEnd w:id="64"/>
-    <w:bookmarkStart w:id="65" w:name="ref-rawlings2017mpc"/>
+    <w:bookmarkEnd w:id="65"/>
+    <w:bookmarkStart w:id="66" w:name="ref-rawlings2017mpc"/>
     <w:p>
       <w:pPr>
         <w:pStyle w:val="Bibliography"/>
@@ -4700,8 +4707,8 @@
         <w:t xml:space="preserve"> </w:t>
       </w:r>
     </w:p>
-    <w:bookmarkEnd w:id="65"/>
-    <w:bookmarkStart w:id="66" w:name="ref-paperA"/>
+    <w:bookmarkEnd w:id="66"/>
+    <w:bookmarkStart w:id="67" w:name="ref-paperA"/>
     <w:p>
       <w:pPr>
         <w:pStyle w:val="Bibliography"/>
@@ -4722,8 +4729,8 @@
         <w:t xml:space="preserve"> </w:t>
       </w:r>
     </w:p>
-    <w:bookmarkEnd w:id="66"/>
-    <w:bookmarkStart w:id="68" w:name="ref-feinberg2019crnt"/>
+    <w:bookmarkEnd w:id="67"/>
+    <w:bookmarkStart w:id="69" w:name="ref-feinberg2019crnt"/>
     <w:p>
       <w:pPr>
         <w:pStyle w:val="Bibliography"/>
@@ -4740,7 +4747,7 @@
       <w:r>
         <w:t xml:space="preserve">Feinberg, M. Foundations of chemical reaction network theory. Springer, Cham, Switzerland, 2019. doi:</w:t>
       </w:r>
-      <w:hyperlink r:id="rId67">
+      <w:hyperlink r:id="rId68">
         <w:r>
           <w:rPr>
             <w:rStyle w:val="Hyperlink"/>
@@ -4749,8 +4756,8 @@
         </w:r>
       </w:hyperlink>
     </w:p>
-    <w:bookmarkEnd w:id="68"/>
-    <w:bookmarkStart w:id="69" w:name="ref-alon2019systems"/>
+    <w:bookmarkEnd w:id="69"/>
+    <w:bookmarkStart w:id="70" w:name="ref-alon2019systems"/>
     <w:p>
       <w:pPr>
         <w:pStyle w:val="Bibliography"/>
@@ -4771,8 +4778,8 @@
         <w:t xml:space="preserve"> </w:t>
       </w:r>
     </w:p>
-    <w:bookmarkEnd w:id="69"/>
-    <w:bookmarkStart w:id="70" w:name="ref-kacser1973control"/>
+    <w:bookmarkEnd w:id="70"/>
+    <w:bookmarkStart w:id="71" w:name="ref-kacser1973control"/>
     <w:p>
       <w:pPr>
         <w:pStyle w:val="Bibliography"/>
@@ -4793,8 +4800,8 @@
         <w:t xml:space="preserve"> </w:t>
       </w:r>
     </w:p>
-    <w:bookmarkEnd w:id="70"/>
-    <w:bookmarkStart w:id="72" w:name="ref-heinrich1974linear"/>
+    <w:bookmarkEnd w:id="71"/>
+    <w:bookmarkStart w:id="73" w:name="ref-heinrich1974linear"/>
     <w:p>
       <w:pPr>
         <w:pStyle w:val="Bibliography"/>
@@ -4811,7 +4818,7 @@
       <w:r>
         <w:t xml:space="preserve">Heinrich, R., and Rapoport, T. A. A linear steady-state treatment of enzymatic chains: General properties, control and effector strength. European Journal of Biochemistry, 1974;42:89–95. doi:</w:t>
       </w:r>
-      <w:hyperlink r:id="rId71">
+      <w:hyperlink r:id="rId72">
         <w:r>
           <w:rPr>
             <w:rStyle w:val="Hyperlink"/>
@@ -4820,8 +4827,8 @@
         </w:r>
       </w:hyperlink>
     </w:p>
-    <w:bookmarkEnd w:id="72"/>
-    <w:bookmarkStart w:id="73" w:name="ref-fell1997understanding"/>
+    <w:bookmarkEnd w:id="73"/>
+    <w:bookmarkStart w:id="74" w:name="ref-fell1997understanding"/>
     <w:p>
       <w:pPr>
         <w:pStyle w:val="Bibliography"/>
@@ -4842,8 +4849,8 @@
         <w:t xml:space="preserve"> </w:t>
       </w:r>
     </w:p>
-    <w:bookmarkEnd w:id="73"/>
-    <w:bookmarkStart w:id="75" w:name="ref-andersson2019casadi"/>
+    <w:bookmarkEnd w:id="74"/>
+    <w:bookmarkStart w:id="76" w:name="ref-andersson2019casadi"/>
     <w:p>
       <w:pPr>
         <w:pStyle w:val="Bibliography"/>
@@ -4872,7 +4879,7 @@
       <w:r>
         <w:t xml:space="preserve">– a software framework for nonlinear optimization and optimal control. Mathematical Programming Computation, 2019;11:1–36. doi:</w:t>
       </w:r>
-      <w:hyperlink r:id="rId74">
+      <w:hyperlink r:id="rId75">
         <w:r>
           <w:rPr>
             <w:rStyle w:val="Hyperlink"/>
@@ -4881,8 +4888,8 @@
         </w:r>
       </w:hyperlink>
     </w:p>
-    <w:bookmarkEnd w:id="75"/>
-    <w:bookmarkStart w:id="77" w:name="ref-wachter2006ipopt"/>
+    <w:bookmarkEnd w:id="76"/>
+    <w:bookmarkStart w:id="78" w:name="ref-wachter2006ipopt"/>
     <w:p>
       <w:pPr>
         <w:pStyle w:val="Bibliography"/>
@@ -4899,7 +4906,7 @@
       <w:r>
         <w:t xml:space="preserve">Wächter, A., and Biegler, L. T. On the implementation of an interior-point filter line-search algorithm for large-scale nonlinear programming. Mathematical Programming, 2006;106:25–57. doi:</w:t>
       </w:r>
-      <w:hyperlink r:id="rId76">
+      <w:hyperlink r:id="rId77">
         <w:r>
           <w:rPr>
             <w:rStyle w:val="Hyperlink"/>
@@ -4908,8 +4915,8 @@
         </w:r>
       </w:hyperlink>
     </w:p>
-    <w:bookmarkEnd w:id="77"/>
-    <w:bookmarkStart w:id="79" w:name="ref-kothare1996robust"/>
+    <w:bookmarkEnd w:id="78"/>
+    <w:bookmarkStart w:id="80" w:name="ref-kothare1996robust"/>
     <w:p>
       <w:pPr>
         <w:pStyle w:val="Bibliography"/>
@@ -4926,7 +4933,7 @@
       <w:r>
         <w:t xml:space="preserve">Kothare, M. V., Balakrishnan, V., and Morari, M. Robust constrained model predictive control using linear matrix inequalities. Automatica, 1996;32:1361–1379. doi:</w:t>
       </w:r>
-      <w:hyperlink r:id="rId78">
+      <w:hyperlink r:id="rId79">
         <w:r>
           <w:rPr>
             <w:rStyle w:val="Hyperlink"/>
@@ -4935,8 +4942,8 @@
         </w:r>
       </w:hyperlink>
     </w:p>
-    <w:bookmarkEnd w:id="79"/>
-    <w:bookmarkStart w:id="81" w:name="ref-scokaert1998minmax"/>
+    <w:bookmarkEnd w:id="80"/>
+    <w:bookmarkStart w:id="82" w:name="ref-scokaert1998minmax"/>
     <w:p>
       <w:pPr>
         <w:pStyle w:val="Bibliography"/>
@@ -4953,7 +4960,7 @@
       <w:r>
         <w:t xml:space="preserve">Scokaert, P. O. M., and Mayne, D. Q. Min-max feedback model predictive control for constrained linear systems. IEEE Transactions on Automatic Control, 1998;43:1136–1142. doi:</w:t>
       </w:r>
-      <w:hyperlink r:id="rId80">
+      <w:hyperlink r:id="rId81">
         <w:r>
           <w:rPr>
             <w:rStyle w:val="Hyperlink"/>
@@ -4962,8 +4969,8 @@
         </w:r>
       </w:hyperlink>
     </w:p>
-    <w:bookmarkEnd w:id="81"/>
-    <w:bookmarkStart w:id="83" w:name="ref-mayne2005tube"/>
+    <w:bookmarkEnd w:id="82"/>
+    <w:bookmarkStart w:id="84" w:name="ref-mayne2005tube"/>
     <w:p>
       <w:pPr>
         <w:pStyle w:val="Bibliography"/>
@@ -4980,7 +4987,7 @@
       <w:r>
         <w:t xml:space="preserve">Mayne, D. Q., Seron, M. M., and Raković, S. V. Robust model predictive control of constrained linear systems with bounded disturbances. Automatica, 2005;41:219–224. doi:</w:t>
       </w:r>
-      <w:hyperlink r:id="rId82">
+      <w:hyperlink r:id="rId83">
         <w:r>
           <w:rPr>
             <w:rStyle w:val="Hyperlink"/>
@@ -4989,8 +4996,8 @@
         </w:r>
       </w:hyperlink>
     </w:p>
-    <w:bookmarkEnd w:id="83"/>
-    <w:bookmarkStart w:id="85" w:name="ref-calafiore2006scenario"/>
+    <w:bookmarkEnd w:id="84"/>
+    <w:bookmarkStart w:id="86" w:name="ref-calafiore2006scenario"/>
     <w:p>
       <w:pPr>
         <w:pStyle w:val="Bibliography"/>
@@ -5007,7 +5014,7 @@
       <w:r>
         <w:t xml:space="preserve">Calafiore, G. C., and Campi, M. C. The scenario approach to robust control design. IEEE Transactions on Automatic Control, 2006;51:742–753. doi:</w:t>
       </w:r>
-      <w:hyperlink r:id="rId84">
+      <w:hyperlink r:id="rId85">
         <w:r>
           <w:rPr>
             <w:rStyle w:val="Hyperlink"/>
@@ -5016,8 +5023,8 @@
         </w:r>
       </w:hyperlink>
     </w:p>
-    <w:bookmarkEnd w:id="85"/>
-    <w:bookmarkStart w:id="87" w:name="ref-campi2008exact"/>
+    <w:bookmarkEnd w:id="86"/>
+    <w:bookmarkStart w:id="88" w:name="ref-campi2008exact"/>
     <w:p>
       <w:pPr>
         <w:pStyle w:val="Bibliography"/>
@@ -5034,7 +5041,7 @@
       <w:r>
         <w:t xml:space="preserve">Campi, M. C., and Garatti, S. The exact feasibility of randomized solutions of uncertain convex programs. SIAM Journal on Optimization, 2008;19:1211–1230. doi:</w:t>
       </w:r>
-      <w:hyperlink r:id="rId86">
+      <w:hyperlink r:id="rId87">
         <w:r>
           <w:rPr>
             <w:rStyle w:val="Hyperlink"/>
@@ -5043,8 +5050,8 @@
         </w:r>
       </w:hyperlink>
     </w:p>
-    <w:bookmarkEnd w:id="87"/>
-    <w:bookmarkStart w:id="89" w:name="ref-bertsimas2011robust"/>
+    <w:bookmarkEnd w:id="88"/>
+    <w:bookmarkStart w:id="90" w:name="ref-bertsimas2011robust"/>
     <w:p>
       <w:pPr>
         <w:pStyle w:val="Bibliography"/>
@@ -5061,7 +5068,7 @@
       <w:r>
         <w:t xml:space="preserve">Bertsimas, D., Brown, D. B., and Caramanis, C. Theory and applications of robust optimization. SIAM Review, 2011;53:464–501. doi:</w:t>
       </w:r>
-      <w:hyperlink r:id="rId88">
+      <w:hyperlink r:id="rId89">
         <w:r>
           <w:rPr>
             <w:rStyle w:val="Hyperlink"/>
@@ -5070,8 +5077,8 @@
         </w:r>
       </w:hyperlink>
     </w:p>
-    <w:bookmarkEnd w:id="89"/>
-    <w:bookmarkStart w:id="91" w:name="ref-selkov1968"/>
+    <w:bookmarkEnd w:id="90"/>
+    <w:bookmarkStart w:id="92" w:name="ref-selkov1968"/>
     <w:p>
       <w:pPr>
         <w:pStyle w:val="Bibliography"/>
@@ -5088,7 +5095,7 @@
       <w:r>
         <w:t xml:space="preserve">Sel’kov, E. E. Self-oscillations in glycolysis. 1. A simple kinetic model. European Journal of Biochemistry, 1968;4:79–86. doi:</w:t>
       </w:r>
-      <w:hyperlink r:id="rId90">
+      <w:hyperlink r:id="rId91">
         <w:r>
           <w:rPr>
             <w:rStyle w:val="Hyperlink"/>
@@ -5097,8 +5104,8 @@
         </w:r>
       </w:hyperlink>
     </w:p>
-    <w:bookmarkEnd w:id="91"/>
-    <w:bookmarkStart w:id="93" w:name="ref-wolf2000"/>
+    <w:bookmarkEnd w:id="92"/>
+    <w:bookmarkStart w:id="94" w:name="ref-wolf2000"/>
     <w:p>
       <w:pPr>
         <w:pStyle w:val="Bibliography"/>
@@ -5115,7 +5122,7 @@
       <w:r>
         <w:t xml:space="preserve">Wolf, J., and Heinrich, R. Effect of cellular interaction on glycolytic oscillations in yeast: A theoretical investigation. Biochemical Journal, 2000;345:321–334. doi:</w:t>
       </w:r>
-      <w:hyperlink r:id="rId92">
+      <w:hyperlink r:id="rId93">
         <w:r>
           <w:rPr>
             <w:rStyle w:val="Hyperlink"/>
@@ -5124,8 +5131,8 @@
         </w:r>
       </w:hyperlink>
     </w:p>
-    <w:bookmarkEnd w:id="93"/>
-    <w:bookmarkStart w:id="95" w:name="ref-bental1998robust"/>
+    <w:bookmarkEnd w:id="94"/>
+    <w:bookmarkStart w:id="96" w:name="ref-bental1998robust"/>
     <w:p>
       <w:pPr>
         <w:pStyle w:val="Bibliography"/>
@@ -5142,7 +5149,7 @@
       <w:r>
         <w:t xml:space="preserve">Ben-Tal, A., and Nemirovski, A. Robust convex optimization. Mathematics of Operations Research, 1998;23:769–805. doi:</w:t>
       </w:r>
-      <w:hyperlink r:id="rId94">
+      <w:hyperlink r:id="rId95">
         <w:r>
           <w:rPr>
             <w:rStyle w:val="Hyperlink"/>
@@ -5151,9 +5158,9 @@
         </w:r>
       </w:hyperlink>
     </w:p>
-    <w:bookmarkEnd w:id="95"/>
     <w:bookmarkEnd w:id="96"/>
     <w:bookmarkEnd w:id="97"/>
+    <w:bookmarkEnd w:id="98"/>
     <w:sectPr>
       <w:footnotePr>
         <w:numRestart w:val="eachSect"/>

</xml_diff>

<commit_message>
Paper B: fix dangling-colon grammar in novelty sentence
</commit_message>
<xml_diff>
--- a/paper/softwarex.docx
+++ b/paper/softwarex.docx
@@ -1050,25 +1050,25 @@
         <w:t xml:space="preserve"> </w:t>
       </w:r>
       <w:r>
-        <w:t xml:space="preserve">supplies both. No novel scientific result is claimed: ROP, FEC and the log-derivative geometry are the prior work of</w:t>
-      </w:r>
-      <w:r>
-        <w:t xml:space="preserve"> </w:t>
-      </w:r>
-      <w:r>
-        <w:t xml:space="preserve">Xiao and colleagues; the contribution is the open, tested, reproducible implementation and the honest</w:t>
-      </w:r>
-      <w:r>
-        <w:t xml:space="preserve"> </w:t>
-      </w:r>
-      <w:r>
-        <w:t xml:space="preserve">map around it, not a new method:</w:t>
-      </w:r>
-      <w:r>
-        <w:t xml:space="preserve"> </w:t>
-      </w:r>
-      <w:r>
-        <w:t xml:space="preserve">and we are deliberately conservative about novelty. Concretely the package provides:</w:t>
+        <w:t xml:space="preserve">supplies both. No novel scientific result is claimed: ROP, FEC and the log-derivative</w:t>
+      </w:r>
+      <w:r>
+        <w:t xml:space="preserve"> </w:t>
+      </w:r>
+      <w:r>
+        <w:t xml:space="preserve">geometry are the prior work of Xiao and colleagues; the contribution is the open, tested,</w:t>
+      </w:r>
+      <w:r>
+        <w:t xml:space="preserve"> </w:t>
+      </w:r>
+      <w:r>
+        <w:t xml:space="preserve">reproducible implementation and the honest map around it, not a new method, and we are</w:t>
+      </w:r>
+      <w:r>
+        <w:t xml:space="preserve"> </w:t>
+      </w:r>
+      <w:r>
+        <w:t xml:space="preserve">deliberately conservative about novelty. Concretely the package provides:</w:t>
       </w:r>
     </w:p>
     <w:p>

</xml_diff>

<commit_message>
Paper B: apply ultimate-audit fixes (honest negative result + math/refs/figure)
- HONEST REFRAME: rigorous 60-seed analysis shows data-poor ROP (2.31) vs random (2.34) is a
  ~1% difference within the +-0.58 scatter (not 'zero'); informative regime ROP inactive
  (all 0.04). Abstract 'not materially improve'; body/caption report effect size honestly;
  negative figure -> 2 panels (independent scales) + error bars + 3-decimal numbers
- 'across 50 seeds' -> single deterministic evaluation (the runs are bit-identical repeats)
- math: rate v_r(x,alpha) explicit; cite uncited Xiao-lineage (xiao2021structure/xiao2018rpa)
  + MPC survey (bemporad1999survey)
Co-Authored-By: Claude Opus 4.8 <noreply@anthropic.com>
</commit_message>
<xml_diff>
--- a/paper/softwarex.docx
+++ b/paper/softwarex.docx
@@ -239,7 +239,7 @@
           <w:i/>
           <w:iCs/>
         </w:rPr>
-        <w:t xml:space="preserve">not</w:t>
+        <w:t xml:space="preserve">not materially</w:t>
       </w:r>
       <w:r>
         <w:t xml:space="preserve"> </w:t>
@@ -831,7 +831,7 @@
         <w:t xml:space="preserve">another </w:t>
       </w:r>
       <w:r>
-        <w:t xml:space="preserve">[9,10]</w:t>
+        <w:t xml:space="preserve">[9–12]</w:t>
       </w:r>
       <w:r>
         <w:t xml:space="preserve">: in a power-law description the reaction-order</w:t>
@@ -909,7 +909,7 @@
         <w:t xml:space="preserve">tractable by model predictive control </w:t>
       </w:r>
       <w:r>
-        <w:t xml:space="preserve">[11]</w:t>
+        <w:t xml:space="preserve">[13,14]</w:t>
       </w:r>
       <w:r>
         <w:t xml:space="preserve">. Because the admissible</w:t>
@@ -1000,7 +1000,7 @@
         <w:t xml:space="preserve">separately </w:t>
       </w:r>
       <w:r>
-        <w:t xml:space="preserve">[12]</w:t>
+        <w:t xml:space="preserve">[15]</w:t>
       </w:r>
       <w:r>
         <w:t xml:space="preserve">. To be used, built upon, and trusted in that setting, the</w:t>
@@ -1160,13 +1160,13 @@
         <w:t xml:space="preserve"> </w:t>
       </w:r>
       <w:r>
-        <w:t xml:space="preserve">a count-matched random-facet null and finds it confers no advantage for data-driven order</w:t>
-      </w:r>
-      <w:r>
-        <w:t xml:space="preserve"> </w:t>
-      </w:r>
-      <w:r>
-        <w:t xml:space="preserve">estimation (Section 3). Self-skepticism is shipped as a re-runnable feature, so</w:t>
+        <w:t xml:space="preserve">a count-matched random-facet null and finds it confers at most a marginal advantage for</w:t>
+      </w:r>
+      <w:r>
+        <w:t xml:space="preserve"> </w:t>
+      </w:r>
+      <w:r>
+        <w:t xml:space="preserve">data-driven order estimation (Section 3). Self-skepticism is shipped as a re-runnable feature, so</w:t>
       </w:r>
       <w:r>
         <w:t xml:space="preserve"> </w:t>
@@ -1195,7 +1195,7 @@
         <w:t xml:space="preserve">components; no wet-lab data are introduced here (those live in </w:t>
       </w:r>
       <w:r>
-        <w:t xml:space="preserve">[12]</w:t>
+        <w:t xml:space="preserve">[15]</w:t>
       </w:r>
       <w:r>
         <w:t xml:space="preserve">). For a</w:t>
@@ -1332,7 +1332,7 @@
         <w:t xml:space="preserve">rates </w:t>
       </w:r>
       <w:r>
-        <w:t xml:space="preserve">[13,14]</w:t>
+        <w:t xml:space="preserve">[16,17]</w:t>
       </w:r>
       <w:r>
         <w:t xml:space="preserve">,</w:t>
@@ -1367,6 +1367,15 @@
           </m:r>
           <m:r>
             <m:t>x</m:t>
+          </m:r>
+          <m:r>
+            <m:rPr>
+              <m:sty m:val="p"/>
+            </m:rPr>
+            <m:t>,</m:t>
+          </m:r>
+          <m:r>
+            <m:t>α</m:t>
           </m:r>
           <m:r>
             <m:rPr>
@@ -2227,7 +2236,7 @@
         <w:t xml:space="preserve"> </w:t>
       </w:r>
       <w:r>
-        <w:t xml:space="preserve">[15–17]</w:t>
+        <w:t xml:space="preserve">[18–20]</w:t>
       </w:r>
       <w:r>
         <w:t xml:space="preserve">.</w:t>
@@ -2464,7 +2473,7 @@
         <w:t xml:space="preserve">CasADi </w:t>
       </w:r>
       <w:r>
-        <w:t xml:space="preserve">[18]</w:t>
+        <w:t xml:space="preserve">[21]</w:t>
       </w:r>
       <w:r>
         <w:t xml:space="preserve"> </w:t>
@@ -2473,7 +2482,7 @@
         <w:t xml:space="preserve">and solved with IPOPT </w:t>
       </w:r>
       <w:r>
-        <w:t xml:space="preserve">[19]</w:t>
+        <w:t xml:space="preserve">[22]</w:t>
       </w:r>
       <w:r>
         <w:t xml:space="preserve">; a SciPy</w:t>
@@ -2517,7 +2526,7 @@
         <w:t xml:space="preserve">machinery </w:t>
       </w:r>
       <w:r>
-        <w:t xml:space="preserve">[20–25]</w:t>
+        <w:t xml:space="preserve">[23–28]</w:t>
       </w:r>
       <w:r>
         <w:t xml:space="preserve">.</w:t>
@@ -2696,7 +2705,7 @@
         <w:t xml:space="preserve">model </w:t>
       </w:r>
       <w:r>
-        <w:t xml:space="preserve">[26]</w:t>
+        <w:t xml:space="preserve">[29]</w:t>
       </w:r>
       <w:r>
         <w:t xml:space="preserve"> </w:t>
@@ -2711,7 +2720,7 @@
         <w:t xml:space="preserve">model </w:t>
       </w:r>
       <w:r>
-        <w:t xml:space="preserve">[27]</w:t>
+        <w:t xml:space="preserve">[30]</w:t>
       </w:r>
       <w:r>
         <w:t xml:space="preserve">, in pure NumPy/SciPy with tests asserting the known limit-cycle</w:t>
@@ -2951,7 +2960,7 @@
         <w:t xml:space="preserve">recovery; the BOS pattern </w:t>
       </w:r>
       <w:r>
-        <w:t xml:space="preserve">[12]</w:t>
+        <w:t xml:space="preserve">[15]</w:t>
       </w:r>
       <w:r>
         <w:t xml:space="preserve">), for which the ROP supplies the admissible</w:t>
@@ -3140,7 +3149,7 @@
         <w:t xml:space="preserve"> </w:t>
       </w:r>
       <w:r>
-        <w:t xml:space="preserve">MM-derived exponent policies across 50 seeds (</w:t>
+        <w:t xml:space="preserve">MM-derived exponent policies (</w:t>
       </w:r>
       <m:oMath>
         <m:r>
@@ -3176,13 +3185,13 @@
         </m:r>
       </m:oMath>
       <w:r>
-        <w:t xml:space="preserve">; all three respect the</w:t>
-      </w:r>
-      <w:r>
-        <w:t xml:space="preserve"> </w:t>
-      </w:r>
-      <w:r>
-        <w:t xml:space="preserve">polytope), and a scenario-robust variant bounds the worst case at near-nominal cost — internal</w:t>
+        <w:t xml:space="preserve">; a single deterministic evaluation,</w:t>
+      </w:r>
+      <w:r>
+        <w:t xml:space="preserve"> </w:t>
+      </w:r>
+      <w:r>
+        <w:t xml:space="preserve">all three respecting the polytope), and a scenario-robust variant bounds the worst case at near-nominal cost — internal</w:t>
       </w:r>
       <w:r>
         <w:t xml:space="preserve"> </w:t>
@@ -3560,7 +3569,7 @@
         <w:t xml:space="preserve"> </w:t>
       </w:r>
       <w:r>
-        <w:t xml:space="preserve">[28]</w:t>
+        <w:t xml:space="preserve">[31]</w:t>
       </w:r>
       <w:r>
         <w:t xml:space="preserve">. We measure total reaction-order</w:t>
@@ -3577,7 +3586,7 @@
         <w:pStyle w:val="BodyText"/>
       </w:pPr>
       <w:r>
-        <w:t xml:space="preserve">The result is negative. When data are informative the ROP is</w:t>
+        <w:t xml:space="preserve">The result is negative in substance. When data are informative the ROP is</w:t>
       </w:r>
       <w:r>
         <w:t xml:space="preserve"> </w:t>
@@ -3590,13 +3599,13 @@
         <w:t xml:space="preserve">inactive</w:t>
       </w:r>
       <w:r>
-        <w:t xml:space="preserve">: the data,</w:t>
-      </w:r>
-      <w:r>
-        <w:t xml:space="preserve"> </w:t>
-      </w:r>
-      <w:r>
-        <w:t xml:space="preserve">data</w:t>
+        <w:t xml:space="preserve">:</w:t>
+      </w:r>
+      <w:r>
+        <w:t xml:space="preserve"> </w:t>
+      </w:r>
+      <w:r>
+        <w:t xml:space="preserve">data, data</w:t>
       </w:r>
       <m:oMath>
         <m:r>
@@ -3634,46 +3643,117 @@
           <m:t>≈</m:t>
         </m:r>
         <m:r>
-          <m:t>0.048</m:t>
+          <m:t>0.04</m:t>
         </m:r>
       </m:oMath>
       <w:r>
-        <w:t xml:space="preserve">) — the data already constrain the orders more tightly than the ROP does,</w:t>
-      </w:r>
-      <w:r>
-        <w:t xml:space="preserve"> </w:t>
-      </w:r>
-      <w:r>
-        <w:t xml:space="preserve">and its facets never bind. When data are scarce the ROP tightens the set only modestly</w:t>
-      </w:r>
-      <w:r>
-        <w:t xml:space="preserve"> </w:t>
-      </w:r>
-      <w:r>
-        <w:t xml:space="preserve">(</w:t>
+        <w:t xml:space="preserve">), so the data already constrain the orders more tightly than the ROP and its</w:t>
+      </w:r>
+      <w:r>
+        <w:t xml:space="preserve"> </w:t>
+      </w:r>
+      <w:r>
+        <w:t xml:space="preserve">facets never bind. When data are scarce both the ROP and the count-matched random null</w:t>
+      </w:r>
+      <w:r>
+        <w:t xml:space="preserve"> </w:t>
+      </w:r>
+      <w:r>
+        <w:t xml:space="preserve">tighten the set substantially below data-only (</w:t>
       </w:r>
       <m:oMath>
         <m:r>
-          <m:t>2.80</m:t>
-        </m:r>
-        <m:r>
-          <m:t>​</m:t>
-        </m:r>
+          <m:t>2.72</m:t>
+        </m:r>
+      </m:oMath>
+      <w:r>
+        <w:t xml:space="preserve">), to</w:t>
+      </w:r>
+      <w:r>
+        <w:t xml:space="preserve"> </w:t>
+      </w:r>
+      <m:oMath>
+        <m:r>
+          <m:t>2.31</m:t>
+        </m:r>
+      </m:oMath>
+      <w:r>
+        <w:t xml:space="preserve"> </w:t>
+      </w:r>
+      <w:r>
+        <w:t xml:space="preserve">and</w:t>
+      </w:r>
+      <w:r>
+        <w:t xml:space="preserve"> </w:t>
+      </w:r>
+      <m:oMath>
+        <m:r>
+          <m:t>2.34</m:t>
+        </m:r>
+      </m:oMath>
+      <w:r>
+        <w:t xml:space="preserve"> </w:t>
+      </w:r>
+      <w:r>
+        <w:t xml:space="preserve">respectively</w:t>
+      </w:r>
+      <w:r>
+        <w:t xml:space="preserve"> </w:t>
+      </w:r>
+      <w:r>
+        <w:t xml:space="preserve">(60 seeds) — a difference of only</w:t>
+      </w:r>
+      <w:r>
+        <w:t xml:space="preserve"> </w:t>
+      </w:r>
+      <m:oMath>
         <m:r>
           <m:rPr>
             <m:sty m:val="p"/>
           </m:rPr>
-          <m:t>→</m:t>
-        </m:r>
-        <m:r>
-          <m:t>​</m:t>
-        </m:r>
-        <m:r>
-          <m:t>2.34</m:t>
+          <m:t>∼</m:t>
         </m:r>
       </m:oMath>
       <w:r>
-        <w:t xml:space="preserve">) and</w:t>
+        <w:t xml:space="preserve">1% that lies well within the cross-seed scatter</w:t>
+      </w:r>
+      <w:r>
+        <w:t xml:space="preserve"> </w:t>
+      </w:r>
+      <w:r>
+        <w:t xml:space="preserve">(</w:t>
+      </w:r>
+      <m:oMath>
+        <m:r>
+          <m:rPr>
+            <m:sty m:val="p"/>
+          </m:rPr>
+          <m:t>±</m:t>
+        </m:r>
+        <m:r>
+          <m:t>0.58</m:t>
+        </m:r>
+      </m:oMath>
+      <w:r>
+        <w:t xml:space="preserve">). The binding-derived structure therefore adds little to identification beyond a</w:t>
+      </w:r>
+      <w:r>
+        <w:t xml:space="preserve"> </w:t>
+      </w:r>
+      <w:r>
+        <w:t xml:space="preserve">generic constraint of equal size. The interpretation is clarifying rather than</w:t>
+      </w:r>
+      <w:r>
+        <w:t xml:space="preserve"> </w:t>
+      </w:r>
+      <w:r>
+        <w:t xml:space="preserve">discouraging, and it is the package’s transferable thesis: the value of ROP/FEC is as a</w:t>
+      </w:r>
+      <w:r>
+        <w:t xml:space="preserve"> </w:t>
+      </w:r>
+      <w:r>
+        <w:t xml:space="preserve">structural</w:t>
       </w:r>
       <w:r>
         <w:t xml:space="preserve"> </w:t>
@@ -3683,39 +3763,19 @@
           <w:i/>
           <w:iCs/>
         </w:rPr>
-        <w:t xml:space="preserve">no more than the count-matched random set</w:t>
-      </w:r>
-      <w:r>
-        <w:t xml:space="preserve"> </w:t>
-      </w:r>
-      <w:r>
-        <w:t xml:space="preserve">(</w:t>
-      </w:r>
-      <m:oMath>
-        <m:r>
-          <m:t>2.42</m:t>
-        </m:r>
-      </m:oMath>
-      <w:r>
-        <w:t xml:space="preserve">); across</w:t>
-      </w:r>
-      <w:r>
-        <w:t xml:space="preserve"> </w:t>
-      </w:r>
-      <w:r>
-        <w:t xml:space="preserve">trials neither beats the other consistently. The interpretation is clarifying rather than</w:t>
-      </w:r>
-      <w:r>
-        <w:t xml:space="preserve"> </w:t>
-      </w:r>
-      <w:r>
-        <w:t xml:space="preserve">discouraging, and it is the package’s transferable thesis: the value of ROP/FEC is as a</w:t>
-      </w:r>
-      <w:r>
-        <w:t xml:space="preserve"> </w:t>
-      </w:r>
-      <w:r>
-        <w:t xml:space="preserve">structural</w:t>
+        <w:t xml:space="preserve">control-admissibility set</w:t>
+      </w:r>
+      <w:r>
+        <w:t xml:space="preserve"> </w:t>
+      </w:r>
+      <w:r>
+        <w:t xml:space="preserve">— the geometry the controller must respect</w:t>
+      </w:r>
+      <w:r>
+        <w:t xml:space="preserve"> </w:t>
+      </w:r>
+      <w:r>
+        <w:t xml:space="preserve">(example 1) —</w:t>
       </w:r>
       <w:r>
         <w:t xml:space="preserve"> </w:t>
@@ -3725,19 +3785,13 @@
           <w:i/>
           <w:iCs/>
         </w:rPr>
-        <w:t xml:space="preserve">control-admissibility set</w:t>
-      </w:r>
-      <w:r>
-        <w:t xml:space="preserve"> </w:t>
-      </w:r>
-      <w:r>
-        <w:t xml:space="preserve">— the geometry the controller must respect</w:t>
-      </w:r>
-      <w:r>
-        <w:t xml:space="preserve"> </w:t>
-      </w:r>
-      <w:r>
-        <w:t xml:space="preserve">(example 1) —</w:t>
+        <w:t xml:space="preserve">not</w:t>
+      </w:r>
+      <w:r>
+        <w:t xml:space="preserve"> </w:t>
+      </w:r>
+      <w:r>
+        <w:t xml:space="preserve">as a statistical regulariser for</w:t>
       </w:r>
       <w:r>
         <w:t xml:space="preserve"> </w:t>
@@ -3747,22 +3801,6 @@
           <w:i/>
           <w:iCs/>
         </w:rPr>
-        <w:t xml:space="preserve">not</w:t>
-      </w:r>
-      <w:r>
-        <w:t xml:space="preserve"> </w:t>
-      </w:r>
-      <w:r>
-        <w:t xml:space="preserve">as a statistical regulariser for</w:t>
-      </w:r>
-      <w:r>
-        <w:t xml:space="preserve"> </w:t>
-      </w:r>
-      <w:r>
-        <w:rPr>
-          <w:i/>
-          <w:iCs/>
-        </w:rPr>
         <w:t xml:space="preserve">identification</w:t>
       </w:r>
       <w:r>
@@ -3807,7 +3845,7 @@
       <w:r>
         <w:drawing>
           <wp:inline>
-            <wp:extent cx="4319999" cy="2456086"/>
+            <wp:extent cx="5334000" cy="2826919"/>
             <wp:effectExtent b="0" l="0" r="0" t="0"/>
             <wp:docPr descr="" title="" id="33" name="Picture"/>
             <a:graphic>
@@ -3828,7 +3866,7 @@
                   <pic:spPr bwMode="auto">
                     <a:xfrm>
                       <a:off x="0" y="0"/>
-                      <a:ext cx="4319999" cy="2456086"/>
+                      <a:ext cx="5334000" cy="2826919"/>
                     </a:xfrm>
                     <a:prstGeom prst="rect">
                       <a:avLst/>
@@ -3852,23 +3890,30 @@
         <w:pStyle w:val="ImageCaption"/>
       </w:pPr>
       <w:r>
-        <w:rPr>
-          <w:b/>
-          <w:bCs/>
-        </w:rPr>
-        <w:t xml:space="preserve">Figure 4.</w:t>
-      </w:r>
-      <w:r>
-        <w:t xml:space="preserve"> </w:t>
-      </w:r>
-      <w:r>
-        <w:t xml:space="preserve">Built-in falsification (the package’s central result). Total reaction-order</w:t>
-      </w:r>
-      <w:r>
-        <w:t xml:space="preserve"> </w:t>
-      </w:r>
-      <w:r>
-        <w:t xml:space="preserve">uncertainty for the data-only set, data</w:t>
+        <w:t xml:space="preserve">Built-in falsification (the package’s central result; mean</w:t>
+      </w:r>
+      <w:r>
+        <w:t xml:space="preserve"> </w:t>
+      </w:r>
+      <m:oMath>
+        <m:r>
+          <m:rPr>
+            <m:sty m:val="p"/>
+          </m:rPr>
+          <m:t>±</m:t>
+        </m:r>
+      </m:oMath>
+      <w:r>
+        <w:t xml:space="preserve"> </w:t>
+      </w:r>
+      <w:r>
+        <w:t xml:space="preserve">SD over 60 seeds).</w:t>
+      </w:r>
+      <w:r>
+        <w:t xml:space="preserve"> </w:t>
+      </w:r>
+      <w:r>
+        <w:t xml:space="preserve">Total reaction-order uncertainty for the data-only set, data</w:t>
       </w:r>
       <m:oMath>
         <m:r>
@@ -3890,25 +3935,68 @@
         </m:r>
       </m:oMath>
       <w:r>
-        <w:t xml:space="preserve">random (count-matched,</w:t>
-      </w:r>
-      <w:r>
-        <w:t xml:space="preserve"> </w:t>
-      </w:r>
-      <w:r>
-        <w:t xml:space="preserve">truth-covering) sets, in an informative and a data-poor regime. The binding-derived ROP</w:t>
-      </w:r>
-      <w:r>
-        <w:t xml:space="preserve"> </w:t>
-      </w:r>
-      <w:r>
-        <w:t xml:space="preserve">confers no advantage over a random set of equal size: when data are informative it is</w:t>
-      </w:r>
-      <w:r>
-        <w:t xml:space="preserve"> </w:t>
-      </w:r>
-      <w:r>
-        <w:t xml:space="preserve">inactive; when data are scarce it is no better than chance. Shipped as a re-runnable test.</w:t>
+        <w:t xml:space="preserve">random</w:t>
+      </w:r>
+      <w:r>
+        <w:t xml:space="preserve"> </w:t>
+      </w:r>
+      <w:r>
+        <w:t xml:space="preserve">(count-matched, truth-covering) sets, on independent scales for (a) an informative and</w:t>
+      </w:r>
+      <w:r>
+        <w:t xml:space="preserve"> </w:t>
+      </w:r>
+      <w:r>
+        <w:t xml:space="preserve">(b) a data-poor regime. The binding-derived ROP confers at most a marginal advantage over a</w:t>
+      </w:r>
+      <w:r>
+        <w:t xml:space="preserve"> </w:t>
+      </w:r>
+      <w:r>
+        <w:t xml:space="preserve">random set of equal size: when data are informative it is inactive (all three</w:t>
+      </w:r>
+      <w:r>
+        <w:t xml:space="preserve"> </w:t>
+      </w:r>
+      <m:oMath>
+        <m:r>
+          <m:rPr>
+            <m:sty m:val="p"/>
+          </m:rPr>
+          <m:t>≈</m:t>
+        </m:r>
+        <m:r>
+          <m:t>0.04</m:t>
+        </m:r>
+      </m:oMath>
+      <w:r>
+        <w:t xml:space="preserve">);</w:t>
+      </w:r>
+      <w:r>
+        <w:t xml:space="preserve"> </w:t>
+      </w:r>
+      <w:r>
+        <w:t xml:space="preserve">when data are scarce it tightens the set only</w:t>
+      </w:r>
+      <w:r>
+        <w:t xml:space="preserve"> </w:t>
+      </w:r>
+      <m:oMath>
+        <m:r>
+          <m:rPr>
+            <m:sty m:val="p"/>
+          </m:rPr>
+          <m:t>∼</m:t>
+        </m:r>
+      </m:oMath>
+      <w:r>
+        <w:t xml:space="preserve">1% more than the random null</w:t>
+      </w:r>
+      <w:r>
+        <w:t xml:space="preserve"> </w:t>
+      </w:r>
+      <w:r>
+        <w:t xml:space="preserve">(2.31 vs 2.34), well within the cross-seed scatter. Shipped as a re-runnable test.</w:t>
       </w:r>
     </w:p>
     <w:bookmarkEnd w:id="35"/>
@@ -4081,7 +4169,7 @@
         <w:t xml:space="preserve">ecosystem </w:t>
       </w:r>
       <w:r>
-        <w:t xml:space="preserve">[12]</w:t>
+        <w:t xml:space="preserve">[15]</w:t>
       </w:r>
       <w:r>
         <w:t xml:space="preserve">,</w:t>
@@ -4215,7 +4303,7 @@
         <w:t xml:space="preserve">system reported separately </w:t>
       </w:r>
       <w:r>
-        <w:t xml:space="preserve">[12]</w:t>
+        <w:t xml:space="preserve">[15]</w:t>
       </w:r>
       <w:r>
         <w:t xml:space="preserve">.</w:t>
@@ -4373,7 +4461,7 @@
       </w:r>
     </w:p>
     <w:bookmarkEnd w:id="45"/>
-    <w:bookmarkStart w:id="98" w:name="references"/>
+    <w:bookmarkStart w:id="104" w:name="references"/>
     <w:p>
       <w:pPr>
         <w:pStyle w:val="Heading1"/>
@@ -4382,7 +4470,7 @@
         <w:t xml:space="preserve">References</w:t>
       </w:r>
     </w:p>
-    <w:bookmarkStart w:id="97" w:name="refs"/>
+    <w:bookmarkStart w:id="103" w:name="refs"/>
     <w:bookmarkStart w:id="47" w:name="ref-orth2010fba"/>
     <w:p>
       <w:pPr>
@@ -4686,7 +4774,7 @@
       </w:hyperlink>
     </w:p>
     <w:bookmarkEnd w:id="65"/>
-    <w:bookmarkStart w:id="66" w:name="ref-rawlings2017mpc"/>
+    <w:bookmarkStart w:id="67" w:name="ref-xiao2021structure"/>
     <w:p>
       <w:pPr>
         <w:pStyle w:val="Bibliography"/>
@@ -4701,20 +4789,74 @@
         <w:t xml:space="preserve">	</w:t>
       </w:r>
       <w:r>
+        <w:t xml:space="preserve">Xiao, F., Khammash, M., and Doyle, J. C. Stability and control of biomolecular circuits through structure. 2021 american control conference (ACC), 2021;476–483. doi:</w:t>
+      </w:r>
+      <w:hyperlink r:id="rId66">
+        <w:r>
+          <w:rPr>
+            <w:rStyle w:val="Hyperlink"/>
+          </w:rPr>
+          <w:t xml:space="preserve">10.23919/ACC50511.2021.9483039</w:t>
+        </w:r>
+      </w:hyperlink>
+    </w:p>
+    <w:bookmarkEnd w:id="67"/>
+    <w:bookmarkStart w:id="69" w:name="ref-xiao2018rpa"/>
+    <w:p>
+      <w:pPr>
+        <w:pStyle w:val="Bibliography"/>
+      </w:pPr>
+      <w:r>
+        <w:t xml:space="preserve">[12]</w:t>
+      </w:r>
+      <w:r>
+        <w:t xml:space="preserve"> </w:t>
+      </w:r>
+      <w:r>
+        <w:t xml:space="preserve">	</w:t>
+      </w:r>
+      <w:r>
+        <w:t xml:space="preserve">Xiao, F., and Doyle, J. C. Robust perfect adaptation in biomolecular reaction networks. 2018 IEEE conference on decision and control (CDC), 2018;4345–4352. doi:</w:t>
+      </w:r>
+      <w:hyperlink r:id="rId68">
+        <w:r>
+          <w:rPr>
+            <w:rStyle w:val="Hyperlink"/>
+          </w:rPr>
+          <w:t xml:space="preserve">10.1109/CDC.2018.8619101</w:t>
+        </w:r>
+      </w:hyperlink>
+    </w:p>
+    <w:bookmarkEnd w:id="69"/>
+    <w:bookmarkStart w:id="70" w:name="ref-rawlings2017mpc"/>
+    <w:p>
+      <w:pPr>
+        <w:pStyle w:val="Bibliography"/>
+      </w:pPr>
+      <w:r>
+        <w:t xml:space="preserve">[13]</w:t>
+      </w:r>
+      <w:r>
+        <w:t xml:space="preserve"> </w:t>
+      </w:r>
+      <w:r>
+        <w:t xml:space="preserve">	</w:t>
+      </w:r>
+      <w:r>
         <w:t xml:space="preserve">Rawlings, J. B., Mayne, D. Q., and Diehl, M. M. Model predictive control: Theory, computation, and design. Nob Hill Publishing, Madison, WI, 2017.</w:t>
       </w:r>
       <w:r>
         <w:t xml:space="preserve"> </w:t>
       </w:r>
     </w:p>
-    <w:bookmarkEnd w:id="66"/>
-    <w:bookmarkStart w:id="67" w:name="ref-paperA"/>
+    <w:bookmarkEnd w:id="70"/>
+    <w:bookmarkStart w:id="72" w:name="ref-bemporad1999survey"/>
     <w:p>
       <w:pPr>
         <w:pStyle w:val="Bibliography"/>
       </w:pPr>
       <w:r>
-        <w:t xml:space="preserve">[12]</w:t>
+        <w:t xml:space="preserve">[14]</w:t>
       </w:r>
       <w:r>
         <w:t xml:space="preserve"> </w:t>
@@ -4723,20 +4865,47 @@
         <w:t xml:space="preserve">	</w:t>
       </w:r>
       <w:r>
+        <w:t xml:space="preserve">Bemporad, A., and Morari, M. Robust model predictive control: A survey. Robustness in identification and control, 1999;245:207–226. doi:</w:t>
+      </w:r>
+      <w:hyperlink r:id="rId71">
+        <w:r>
+          <w:rPr>
+            <w:rStyle w:val="Hyperlink"/>
+          </w:rPr>
+          <w:t xml:space="preserve">10.1007/BFb0109870</w:t>
+        </w:r>
+      </w:hyperlink>
+    </w:p>
+    <w:bookmarkEnd w:id="72"/>
+    <w:bookmarkStart w:id="73" w:name="ref-paperA"/>
+    <w:p>
+      <w:pPr>
+        <w:pStyle w:val="Bibliography"/>
+      </w:pPr>
+      <w:r>
+        <w:t xml:space="preserve">[15]</w:t>
+      </w:r>
+      <w:r>
+        <w:t xml:space="preserve"> </w:t>
+      </w:r>
+      <w:r>
+        <w:t xml:space="preserve">	</w:t>
+      </w:r>
+      <w:r>
         <w:t xml:space="preserve">Zhou, L., Deng, Q., Li, X., Huang, X., and Chen, G. Decoupling waste deconstruction from nutrient recovery: A staged insect biological operating system for circular valorization of agro-industrial waste. Journal of Cleaner Production (under review), 2026.</w:t>
       </w:r>
       <w:r>
         <w:t xml:space="preserve"> </w:t>
       </w:r>
     </w:p>
-    <w:bookmarkEnd w:id="67"/>
-    <w:bookmarkStart w:id="69" w:name="ref-feinberg2019crnt"/>
+    <w:bookmarkEnd w:id="73"/>
+    <w:bookmarkStart w:id="75" w:name="ref-feinberg2019crnt"/>
     <w:p>
       <w:pPr>
         <w:pStyle w:val="Bibliography"/>
       </w:pPr>
       <w:r>
-        <w:t xml:space="preserve">[13]</w:t>
+        <w:t xml:space="preserve">[16]</w:t>
       </w:r>
       <w:r>
         <w:t xml:space="preserve"> </w:t>
@@ -4747,7 +4916,7 @@
       <w:r>
         <w:t xml:space="preserve">Feinberg, M. Foundations of chemical reaction network theory. Springer, Cham, Switzerland, 2019. doi:</w:t>
       </w:r>
-      <w:hyperlink r:id="rId68">
+      <w:hyperlink r:id="rId74">
         <w:r>
           <w:rPr>
             <w:rStyle w:val="Hyperlink"/>
@@ -4756,14 +4925,14 @@
         </w:r>
       </w:hyperlink>
     </w:p>
-    <w:bookmarkEnd w:id="69"/>
-    <w:bookmarkStart w:id="70" w:name="ref-alon2019systems"/>
+    <w:bookmarkEnd w:id="75"/>
+    <w:bookmarkStart w:id="76" w:name="ref-alon2019systems"/>
     <w:p>
       <w:pPr>
         <w:pStyle w:val="Bibliography"/>
       </w:pPr>
       <w:r>
-        <w:t xml:space="preserve">[14]</w:t>
+        <w:t xml:space="preserve">[17]</w:t>
       </w:r>
       <w:r>
         <w:t xml:space="preserve"> </w:t>
@@ -4778,14 +4947,14 @@
         <w:t xml:space="preserve"> </w:t>
       </w:r>
     </w:p>
-    <w:bookmarkEnd w:id="70"/>
-    <w:bookmarkStart w:id="71" w:name="ref-kacser1973control"/>
+    <w:bookmarkEnd w:id="76"/>
+    <w:bookmarkStart w:id="77" w:name="ref-kacser1973control"/>
     <w:p>
       <w:pPr>
         <w:pStyle w:val="Bibliography"/>
       </w:pPr>
       <w:r>
-        <w:t xml:space="preserve">[15]</w:t>
+        <w:t xml:space="preserve">[18]</w:t>
       </w:r>
       <w:r>
         <w:t xml:space="preserve"> </w:t>
@@ -4800,14 +4969,14 @@
         <w:t xml:space="preserve"> </w:t>
       </w:r>
     </w:p>
-    <w:bookmarkEnd w:id="71"/>
-    <w:bookmarkStart w:id="73" w:name="ref-heinrich1974linear"/>
+    <w:bookmarkEnd w:id="77"/>
+    <w:bookmarkStart w:id="79" w:name="ref-heinrich1974linear"/>
     <w:p>
       <w:pPr>
         <w:pStyle w:val="Bibliography"/>
       </w:pPr>
       <w:r>
-        <w:t xml:space="preserve">[16]</w:t>
+        <w:t xml:space="preserve">[19]</w:t>
       </w:r>
       <w:r>
         <w:t xml:space="preserve"> </w:t>
@@ -4818,7 +4987,7 @@
       <w:r>
         <w:t xml:space="preserve">Heinrich, R., and Rapoport, T. A. A linear steady-state treatment of enzymatic chains: General properties, control and effector strength. European Journal of Biochemistry, 1974;42:89–95. doi:</w:t>
       </w:r>
-      <w:hyperlink r:id="rId72">
+      <w:hyperlink r:id="rId78">
         <w:r>
           <w:rPr>
             <w:rStyle w:val="Hyperlink"/>
@@ -4827,14 +4996,14 @@
         </w:r>
       </w:hyperlink>
     </w:p>
-    <w:bookmarkEnd w:id="73"/>
-    <w:bookmarkStart w:id="74" w:name="ref-fell1997understanding"/>
+    <w:bookmarkEnd w:id="79"/>
+    <w:bookmarkStart w:id="80" w:name="ref-fell1997understanding"/>
     <w:p>
       <w:pPr>
         <w:pStyle w:val="Bibliography"/>
       </w:pPr>
       <w:r>
-        <w:t xml:space="preserve">[17]</w:t>
+        <w:t xml:space="preserve">[20]</w:t>
       </w:r>
       <w:r>
         <w:t xml:space="preserve"> </w:t>
@@ -4849,14 +5018,14 @@
         <w:t xml:space="preserve"> </w:t>
       </w:r>
     </w:p>
-    <w:bookmarkEnd w:id="74"/>
-    <w:bookmarkStart w:id="76" w:name="ref-andersson2019casadi"/>
+    <w:bookmarkEnd w:id="80"/>
+    <w:bookmarkStart w:id="82" w:name="ref-andersson2019casadi"/>
     <w:p>
       <w:pPr>
         <w:pStyle w:val="Bibliography"/>
       </w:pPr>
       <w:r>
-        <w:t xml:space="preserve">[18]</w:t>
+        <w:t xml:space="preserve">[21]</w:t>
       </w:r>
       <w:r>
         <w:t xml:space="preserve"> </w:t>
@@ -4879,7 +5048,7 @@
       <w:r>
         <w:t xml:space="preserve">– a software framework for nonlinear optimization and optimal control. Mathematical Programming Computation, 2019;11:1–36. doi:</w:t>
       </w:r>
-      <w:hyperlink r:id="rId75">
+      <w:hyperlink r:id="rId81">
         <w:r>
           <w:rPr>
             <w:rStyle w:val="Hyperlink"/>
@@ -4888,14 +5057,14 @@
         </w:r>
       </w:hyperlink>
     </w:p>
-    <w:bookmarkEnd w:id="76"/>
-    <w:bookmarkStart w:id="78" w:name="ref-wachter2006ipopt"/>
+    <w:bookmarkEnd w:id="82"/>
+    <w:bookmarkStart w:id="84" w:name="ref-wachter2006ipopt"/>
     <w:p>
       <w:pPr>
         <w:pStyle w:val="Bibliography"/>
       </w:pPr>
       <w:r>
-        <w:t xml:space="preserve">[19]</w:t>
+        <w:t xml:space="preserve">[22]</w:t>
       </w:r>
       <w:r>
         <w:t xml:space="preserve"> </w:t>
@@ -4906,7 +5075,7 @@
       <w:r>
         <w:t xml:space="preserve">Wächter, A., and Biegler, L. T. On the implementation of an interior-point filter line-search algorithm for large-scale nonlinear programming. Mathematical Programming, 2006;106:25–57. doi:</w:t>
       </w:r>
-      <w:hyperlink r:id="rId77">
+      <w:hyperlink r:id="rId83">
         <w:r>
           <w:rPr>
             <w:rStyle w:val="Hyperlink"/>
@@ -4915,14 +5084,14 @@
         </w:r>
       </w:hyperlink>
     </w:p>
-    <w:bookmarkEnd w:id="78"/>
-    <w:bookmarkStart w:id="80" w:name="ref-kothare1996robust"/>
+    <w:bookmarkEnd w:id="84"/>
+    <w:bookmarkStart w:id="86" w:name="ref-kothare1996robust"/>
     <w:p>
       <w:pPr>
         <w:pStyle w:val="Bibliography"/>
       </w:pPr>
       <w:r>
-        <w:t xml:space="preserve">[20]</w:t>
+        <w:t xml:space="preserve">[23]</w:t>
       </w:r>
       <w:r>
         <w:t xml:space="preserve"> </w:t>
@@ -4933,7 +5102,7 @@
       <w:r>
         <w:t xml:space="preserve">Kothare, M. V., Balakrishnan, V., and Morari, M. Robust constrained model predictive control using linear matrix inequalities. Automatica, 1996;32:1361–1379. doi:</w:t>
       </w:r>
-      <w:hyperlink r:id="rId79">
+      <w:hyperlink r:id="rId85">
         <w:r>
           <w:rPr>
             <w:rStyle w:val="Hyperlink"/>
@@ -4942,14 +5111,14 @@
         </w:r>
       </w:hyperlink>
     </w:p>
-    <w:bookmarkEnd w:id="80"/>
-    <w:bookmarkStart w:id="82" w:name="ref-scokaert1998minmax"/>
+    <w:bookmarkEnd w:id="86"/>
+    <w:bookmarkStart w:id="88" w:name="ref-scokaert1998minmax"/>
     <w:p>
       <w:pPr>
         <w:pStyle w:val="Bibliography"/>
       </w:pPr>
       <w:r>
-        <w:t xml:space="preserve">[21]</w:t>
+        <w:t xml:space="preserve">[24]</w:t>
       </w:r>
       <w:r>
         <w:t xml:space="preserve"> </w:t>
@@ -4960,7 +5129,7 @@
       <w:r>
         <w:t xml:space="preserve">Scokaert, P. O. M., and Mayne, D. Q. Min-max feedback model predictive control for constrained linear systems. IEEE Transactions on Automatic Control, 1998;43:1136–1142. doi:</w:t>
       </w:r>
-      <w:hyperlink r:id="rId81">
+      <w:hyperlink r:id="rId87">
         <w:r>
           <w:rPr>
             <w:rStyle w:val="Hyperlink"/>
@@ -4969,14 +5138,14 @@
         </w:r>
       </w:hyperlink>
     </w:p>
-    <w:bookmarkEnd w:id="82"/>
-    <w:bookmarkStart w:id="84" w:name="ref-mayne2005tube"/>
+    <w:bookmarkEnd w:id="88"/>
+    <w:bookmarkStart w:id="90" w:name="ref-mayne2005tube"/>
     <w:p>
       <w:pPr>
         <w:pStyle w:val="Bibliography"/>
       </w:pPr>
       <w:r>
-        <w:t xml:space="preserve">[22]</w:t>
+        <w:t xml:space="preserve">[25]</w:t>
       </w:r>
       <w:r>
         <w:t xml:space="preserve"> </w:t>
@@ -4987,7 +5156,7 @@
       <w:r>
         <w:t xml:space="preserve">Mayne, D. Q., Seron, M. M., and Raković, S. V. Robust model predictive control of constrained linear systems with bounded disturbances. Automatica, 2005;41:219–224. doi:</w:t>
       </w:r>
-      <w:hyperlink r:id="rId83">
+      <w:hyperlink r:id="rId89">
         <w:r>
           <w:rPr>
             <w:rStyle w:val="Hyperlink"/>
@@ -4996,14 +5165,14 @@
         </w:r>
       </w:hyperlink>
     </w:p>
-    <w:bookmarkEnd w:id="84"/>
-    <w:bookmarkStart w:id="86" w:name="ref-calafiore2006scenario"/>
+    <w:bookmarkEnd w:id="90"/>
+    <w:bookmarkStart w:id="92" w:name="ref-calafiore2006scenario"/>
     <w:p>
       <w:pPr>
         <w:pStyle w:val="Bibliography"/>
       </w:pPr>
       <w:r>
-        <w:t xml:space="preserve">[23]</w:t>
+        <w:t xml:space="preserve">[26]</w:t>
       </w:r>
       <w:r>
         <w:t xml:space="preserve"> </w:t>
@@ -5014,7 +5183,7 @@
       <w:r>
         <w:t xml:space="preserve">Calafiore, G. C., and Campi, M. C. The scenario approach to robust control design. IEEE Transactions on Automatic Control, 2006;51:742–753. doi:</w:t>
       </w:r>
-      <w:hyperlink r:id="rId85">
+      <w:hyperlink r:id="rId91">
         <w:r>
           <w:rPr>
             <w:rStyle w:val="Hyperlink"/>
@@ -5023,14 +5192,14 @@
         </w:r>
       </w:hyperlink>
     </w:p>
-    <w:bookmarkEnd w:id="86"/>
-    <w:bookmarkStart w:id="88" w:name="ref-campi2008exact"/>
+    <w:bookmarkEnd w:id="92"/>
+    <w:bookmarkStart w:id="94" w:name="ref-campi2008exact"/>
     <w:p>
       <w:pPr>
         <w:pStyle w:val="Bibliography"/>
       </w:pPr>
       <w:r>
-        <w:t xml:space="preserve">[24]</w:t>
+        <w:t xml:space="preserve">[27]</w:t>
       </w:r>
       <w:r>
         <w:t xml:space="preserve"> </w:t>
@@ -5041,7 +5210,7 @@
       <w:r>
         <w:t xml:space="preserve">Campi, M. C., and Garatti, S. The exact feasibility of randomized solutions of uncertain convex programs. SIAM Journal on Optimization, 2008;19:1211–1230. doi:</w:t>
       </w:r>
-      <w:hyperlink r:id="rId87">
+      <w:hyperlink r:id="rId93">
         <w:r>
           <w:rPr>
             <w:rStyle w:val="Hyperlink"/>
@@ -5050,14 +5219,14 @@
         </w:r>
       </w:hyperlink>
     </w:p>
-    <w:bookmarkEnd w:id="88"/>
-    <w:bookmarkStart w:id="90" w:name="ref-bertsimas2011robust"/>
+    <w:bookmarkEnd w:id="94"/>
+    <w:bookmarkStart w:id="96" w:name="ref-bertsimas2011robust"/>
     <w:p>
       <w:pPr>
         <w:pStyle w:val="Bibliography"/>
       </w:pPr>
       <w:r>
-        <w:t xml:space="preserve">[25]</w:t>
+        <w:t xml:space="preserve">[28]</w:t>
       </w:r>
       <w:r>
         <w:t xml:space="preserve"> </w:t>
@@ -5068,7 +5237,7 @@
       <w:r>
         <w:t xml:space="preserve">Bertsimas, D., Brown, D. B., and Caramanis, C. Theory and applications of robust optimization. SIAM Review, 2011;53:464–501. doi:</w:t>
       </w:r>
-      <w:hyperlink r:id="rId89">
+      <w:hyperlink r:id="rId95">
         <w:r>
           <w:rPr>
             <w:rStyle w:val="Hyperlink"/>
@@ -5077,14 +5246,14 @@
         </w:r>
       </w:hyperlink>
     </w:p>
-    <w:bookmarkEnd w:id="90"/>
-    <w:bookmarkStart w:id="92" w:name="ref-selkov1968"/>
+    <w:bookmarkEnd w:id="96"/>
+    <w:bookmarkStart w:id="98" w:name="ref-selkov1968"/>
     <w:p>
       <w:pPr>
         <w:pStyle w:val="Bibliography"/>
       </w:pPr>
       <w:r>
-        <w:t xml:space="preserve">[26]</w:t>
+        <w:t xml:space="preserve">[29]</w:t>
       </w:r>
       <w:r>
         <w:t xml:space="preserve"> </w:t>
@@ -5095,7 +5264,7 @@
       <w:r>
         <w:t xml:space="preserve">Sel’kov, E. E. Self-oscillations in glycolysis. 1. A simple kinetic model. European Journal of Biochemistry, 1968;4:79–86. doi:</w:t>
       </w:r>
-      <w:hyperlink r:id="rId91">
+      <w:hyperlink r:id="rId97">
         <w:r>
           <w:rPr>
             <w:rStyle w:val="Hyperlink"/>
@@ -5104,14 +5273,14 @@
         </w:r>
       </w:hyperlink>
     </w:p>
-    <w:bookmarkEnd w:id="92"/>
-    <w:bookmarkStart w:id="94" w:name="ref-wolf2000"/>
+    <w:bookmarkEnd w:id="98"/>
+    <w:bookmarkStart w:id="100" w:name="ref-wolf2000"/>
     <w:p>
       <w:pPr>
         <w:pStyle w:val="Bibliography"/>
       </w:pPr>
       <w:r>
-        <w:t xml:space="preserve">[27]</w:t>
+        <w:t xml:space="preserve">[30]</w:t>
       </w:r>
       <w:r>
         <w:t xml:space="preserve"> </w:t>
@@ -5122,7 +5291,7 @@
       <w:r>
         <w:t xml:space="preserve">Wolf, J., and Heinrich, R. Effect of cellular interaction on glycolytic oscillations in yeast: A theoretical investigation. Biochemical Journal, 2000;345:321–334. doi:</w:t>
       </w:r>
-      <w:hyperlink r:id="rId93">
+      <w:hyperlink r:id="rId99">
         <w:r>
           <w:rPr>
             <w:rStyle w:val="Hyperlink"/>
@@ -5131,14 +5300,14 @@
         </w:r>
       </w:hyperlink>
     </w:p>
-    <w:bookmarkEnd w:id="94"/>
-    <w:bookmarkStart w:id="96" w:name="ref-bental1998robust"/>
+    <w:bookmarkEnd w:id="100"/>
+    <w:bookmarkStart w:id="102" w:name="ref-bental1998robust"/>
     <w:p>
       <w:pPr>
         <w:pStyle w:val="Bibliography"/>
       </w:pPr>
       <w:r>
-        <w:t xml:space="preserve">[28]</w:t>
+        <w:t xml:space="preserve">[31]</w:t>
       </w:r>
       <w:r>
         <w:t xml:space="preserve"> </w:t>
@@ -5149,7 +5318,7 @@
       <w:r>
         <w:t xml:space="preserve">Ben-Tal, A., and Nemirovski, A. Robust convex optimization. Mathematics of Operations Research, 1998;23:769–805. doi:</w:t>
       </w:r>
-      <w:hyperlink r:id="rId95">
+      <w:hyperlink r:id="rId101">
         <w:r>
           <w:rPr>
             <w:rStyle w:val="Hyperlink"/>
@@ -5158,9 +5327,9 @@
         </w:r>
       </w:hyperlink>
     </w:p>
-    <w:bookmarkEnd w:id="96"/>
-    <w:bookmarkEnd w:id="97"/>
-    <w:bookmarkEnd w:id="98"/>
+    <w:bookmarkEnd w:id="102"/>
+    <w:bookmarkEnd w:id="103"/>
+    <w:bookmarkEnd w:id="104"/>
     <w:sectPr>
       <w:footnotePr>
         <w:numRestart w:val="eachSect"/>

</xml_diff>

<commit_message>
ropfec v1.0.1: version bump for audited submission snapshot
v1.0.0 release predates the flagship-audit fixes (corrected reproduce.md values,
figure labels, CITATION.cff). Bump to v1.0.1 so the cited release matches the
audited code and docs. Engine logic unchanged; numbers identical.

Co-Authored-By: Claude Opus 4.8 <noreply@anthropic.com>
</commit_message>
<xml_diff>
--- a/paper/softwarex.docx
+++ b/paper/softwarex.docx
@@ -407,7 +407,7 @@
               <w:t xml:space="preserve"> </w:t>
             </w:r>
             <w:r>
-              <w:t xml:space="preserve">v1.0.0</w:t>
+              <w:t xml:space="preserve">v1.0.1</w:t>
             </w:r>
           </w:p>
         </w:tc>
@@ -479,7 +479,7 @@
               <w:rPr>
                 <w:rStyle w:val="VerbatimChar"/>
               </w:rPr>
-              <w:t xml:space="preserve">v1.0.0</w:t>
+              <w:t xml:space="preserve">v1.0.1</w:t>
             </w:r>
             <w:r>
               <w:t xml:space="preserve"> </w:t>
@@ -4760,7 +4760,7 @@
         <w:rPr>
           <w:rStyle w:val="VerbatimChar"/>
         </w:rPr>
-        <w:t xml:space="preserve">v1.0.0</w:t>
+        <w:t xml:space="preserve">v1.0.1</w:t>
       </w:r>
       <w:r>
         <w:t xml:space="preserve"> </w:t>

</xml_diff>

<commit_message>
Paper B: fill the real Zenodo DOI (10.5281/zenodo.20805373) — SoftwareX C3 blocker cleared
Zenodo GitHub integration enabled + v1.0.1 re-published -> Zenodo archived the
release and minted DOI 10.5281/zenodo.20805373 (concept 10.5281/zenodo.20805372).
DOI verified resolving (302). Replaced the 'archival deposit pending' placeholder
in C3 and the availability paragraph with the real DOI; added it to CITATION.cff.
This was the last desk-reject blocker for SoftwareX. 11pp, compiles clean.

Co-Authored-By: Claude Opus 4.8 <noreply@anthropic.com>
</commit_message>
<xml_diff>
--- a/paper/softwarex.docx
+++ b/paper/softwarex.docx
@@ -55,7 +55,7 @@
         <w:pStyle w:val="Date"/>
       </w:pPr>
       <w:r>
-        <w:t xml:space="preserve">2026-06-22</w:t>
+        <w:t xml:space="preserve">2026-06-23</w:t>
       </w:r>
     </w:p>
     <w:p>
@@ -322,7 +322,7 @@
         <w:t xml:space="preserve">polytope; metabolic control analysis; optimal control; staged bioconversion; falsification</w:t>
       </w:r>
     </w:p>
-    <w:bookmarkStart w:id="12" w:name="tab:meta"/>
+    <w:bookmarkStart w:id="13" w:name="tab:meta"/>
     <w:p>
       <w:pPr>
         <w:pStyle w:val="TableCaption"/>
@@ -469,8 +469,19 @@
             <w:r>
               <w:t xml:space="preserve"> </w:t>
             </w:r>
+            <w:hyperlink r:id="rId12">
+              <w:r>
+                <w:rPr>
+                  <w:rStyle w:val="Hyperlink"/>
+                </w:rPr>
+                <w:t xml:space="preserve">10.5281/zenodo.20805373</w:t>
+              </w:r>
+            </w:hyperlink>
             <w:r>
-              <w:t xml:space="preserve">Zenodo DOI from the</w:t>
+              <w:t xml:space="preserve"> </w:t>
+            </w:r>
+            <w:r>
+              <w:t xml:space="preserve">(Zenodo,</w:t>
             </w:r>
             <w:r>
               <w:t xml:space="preserve"> </w:t>
@@ -482,20 +493,7 @@
               <w:t xml:space="preserve">v1.0.1</w:t>
             </w:r>
             <w:r>
-              <w:t xml:space="preserve"> </w:t>
-            </w:r>
-            <w:r>
-              <w:t xml:space="preserve">tag</w:t>
-            </w:r>
-            <w:r>
-              <w:t xml:space="preserve"> </w:t>
-            </w:r>
-            <w:r>
-              <w:rPr>
-                <w:i/>
-                <w:iCs/>
-              </w:rPr>
-              <w:t xml:space="preserve">(archival deposit pending at posting)</w:t>
+              <w:t xml:space="preserve">)</w:t>
             </w:r>
           </w:p>
         </w:tc>
@@ -733,8 +731,8 @@
         </w:tc>
       </w:tr>
     </w:tbl>
-    <w:bookmarkEnd w:id="12"/>
-    <w:bookmarkStart w:id="13" w:name="motivation-and-significance"/>
+    <w:bookmarkEnd w:id="13"/>
+    <w:bookmarkStart w:id="14" w:name="motivation-and-significance"/>
     <w:p>
       <w:pPr>
         <w:pStyle w:val="Heading1"/>
@@ -1221,8 +1219,8 @@
         <w:t xml:space="preserve">software contribution, an in-silico scope with reference components is appropriate.</w:t>
       </w:r>
     </w:p>
-    <w:bookmarkEnd w:id="13"/>
-    <w:bookmarkStart w:id="21" w:name="sec:desc"/>
+    <w:bookmarkEnd w:id="14"/>
+    <w:bookmarkStart w:id="22" w:name="sec:desc"/>
     <w:p>
       <w:pPr>
         <w:pStyle w:val="Heading1"/>
@@ -1231,7 +1229,7 @@
         <w:t xml:space="preserve">Software description</w:t>
       </w:r>
     </w:p>
-    <w:bookmarkStart w:id="15" w:name="software-architecture"/>
+    <w:bookmarkStart w:id="16" w:name="software-architecture"/>
     <w:p>
       <w:pPr>
         <w:pStyle w:val="Heading2"/>
@@ -2211,7 +2209,7 @@
         <w:t xml:space="preserve">.</w:t>
       </w:r>
     </w:p>
-    <w:bookmarkStart w:id="14" w:name="Xb776dee7cc28cd212113461d100a97d65f11c29"/>
+    <w:bookmarkStart w:id="15" w:name="Xb776dee7cc28cd212113461d100a97d65f11c29"/>
     <w:p>
       <w:pPr>
         <w:pStyle w:val="Heading4"/>
@@ -2554,9 +2552,9 @@
         <w:t xml:space="preserve">of FEC’s control variable is the small clarifying point, not a theorem.</w:t>
       </w:r>
     </w:p>
-    <w:bookmarkEnd w:id="14"/>
     <w:bookmarkEnd w:id="15"/>
-    <w:bookmarkStart w:id="20" w:name="software-functionalities"/>
+    <w:bookmarkEnd w:id="16"/>
+    <w:bookmarkStart w:id="21" w:name="software-functionalities"/>
     <w:p>
       <w:pPr>
         <w:pStyle w:val="Heading2"/>
@@ -3093,7 +3091,7 @@
         <w:t xml:space="preserve">  PYTHONPATH=. python3 paper/make_softwarex_figs.py # regenerate the data figures + numbers</w:t>
       </w:r>
     </w:p>
-    <w:bookmarkStart w:id="19" w:name="fig:arch"/>
+    <w:bookmarkStart w:id="20" w:name="fig:arch"/>
     <w:p>
       <w:pPr>
         <w:pStyle w:val="CaptionedFigure"/>
@@ -3103,18 +3101,18 @@
           <wp:inline>
             <wp:extent cx="5334000" cy="1518162"/>
             <wp:effectExtent b="0" l="0" r="0" t="0"/>
-            <wp:docPr descr="" title="" id="17" name="Picture"/>
+            <wp:docPr descr="" title="" id="18" name="Picture"/>
             <a:graphic>
               <a:graphicData uri="http://schemas.openxmlformats.org/drawingml/2006/picture">
                 <pic:pic>
                   <pic:nvPicPr>
-                    <pic:cNvPr descr="figures/ropfec_architecture.png" id="18" name="Picture"/>
+                    <pic:cNvPr descr="figures/ropfec_architecture.png" id="19" name="Picture"/>
                     <pic:cNvPicPr>
                       <a:picLocks noChangeArrowheads="1" noChangeAspect="1"/>
                     </pic:cNvPicPr>
                   </pic:nvPicPr>
                   <pic:blipFill>
-                    <a:blip r:embed="rId16"/>
+                    <a:blip r:embed="rId17"/>
                     <a:stretch>
                       <a:fillRect/>
                     </a:stretch>
@@ -3257,10 +3255,10 @@
         <w:t xml:space="preserve">exponent geometry.</w:t>
       </w:r>
     </w:p>
-    <w:bookmarkEnd w:id="19"/>
     <w:bookmarkEnd w:id="20"/>
     <w:bookmarkEnd w:id="21"/>
-    <w:bookmarkStart w:id="37" w:name="sec:examples"/>
+    <w:bookmarkEnd w:id="22"/>
+    <w:bookmarkStart w:id="38" w:name="sec:examples"/>
     <w:p>
       <w:pPr>
         <w:pStyle w:val="Heading1"/>
@@ -3283,7 +3281,7 @@
         <w:t xml:space="preserve">to a script in the repository.</w:t>
       </w:r>
     </w:p>
-    <w:bookmarkStart w:id="26" w:name="X300f97475038c434fb1165f11f0c339bee37779"/>
+    <w:bookmarkStart w:id="27" w:name="X300f97475038c434fb1165f11f0c339bee37779"/>
     <w:p>
       <w:pPr>
         <w:pStyle w:val="Heading4"/>
@@ -3534,7 +3532,7 @@
         <w:t xml:space="preserve">synthetic-trajectory error, not empirical accuracy on biological data.</w:t>
       </w:r>
     </w:p>
-    <w:bookmarkStart w:id="25" w:name="fig:toy"/>
+    <w:bookmarkStart w:id="26" w:name="fig:toy"/>
     <w:p>
       <w:pPr>
         <w:pStyle w:val="CaptionedFigure"/>
@@ -3544,18 +3542,18 @@
           <wp:inline>
             <wp:extent cx="4319999" cy="2829164"/>
             <wp:effectExtent b="0" l="0" r="0" t="0"/>
-            <wp:docPr descr="" title="" id="23" name="Picture"/>
+            <wp:docPr descr="" title="" id="24" name="Picture"/>
             <a:graphic>
               <a:graphicData uri="http://schemas.openxmlformats.org/drawingml/2006/picture">
                 <pic:pic>
                   <pic:nvPicPr>
-                    <pic:cNvPr descr="figures/toy_traj_comparison.png" id="24" name="Picture"/>
+                    <pic:cNvPr descr="figures/toy_traj_comparison.png" id="25" name="Picture"/>
                     <pic:cNvPicPr>
                       <a:picLocks noChangeArrowheads="1" noChangeAspect="1"/>
                     </pic:cNvPicPr>
                   </pic:nvPicPr>
                   <pic:blipFill>
-                    <a:blip r:embed="rId22"/>
+                    <a:blip r:embed="rId23"/>
                     <a:stretch>
                       <a:fillRect/>
                     </a:stretch>
@@ -3649,9 +3647,9 @@
         <w:t xml:space="preserve">). Synthetic ground truth; not a biological benchmark.</w:t>
       </w:r>
     </w:p>
-    <w:bookmarkEnd w:id="25"/>
     <w:bookmarkEnd w:id="26"/>
-    <w:bookmarkStart w:id="31" w:name="validated-oscillator-testbeds."/>
+    <w:bookmarkEnd w:id="27"/>
+    <w:bookmarkStart w:id="32" w:name="validated-oscillator-testbeds."/>
     <w:p>
       <w:pPr>
         <w:pStyle w:val="Heading4"/>
@@ -3698,7 +3696,7 @@
         <w:t xml:space="preserve">the toy network.</w:t>
       </w:r>
     </w:p>
-    <w:bookmarkStart w:id="30" w:name="fig:osc"/>
+    <w:bookmarkStart w:id="31" w:name="fig:osc"/>
     <w:p>
       <w:pPr>
         <w:pStyle w:val="CaptionedFigure"/>
@@ -3708,18 +3706,18 @@
           <wp:inline>
             <wp:extent cx="5334000" cy="2585318"/>
             <wp:effectExtent b="0" l="0" r="0" t="0"/>
-            <wp:docPr descr="" title="" id="28" name="Picture"/>
+            <wp:docPr descr="" title="" id="29" name="Picture"/>
             <a:graphic>
               <a:graphicData uri="http://schemas.openxmlformats.org/drawingml/2006/picture">
                 <pic:pic>
                   <pic:nvPicPr>
-                    <pic:cNvPr descr="figures/case_studies_oscillations.png" id="29" name="Picture"/>
+                    <pic:cNvPr descr="figures/case_studies_oscillations.png" id="30" name="Picture"/>
                     <pic:cNvPicPr>
                       <a:picLocks noChangeArrowheads="1" noChangeAspect="1"/>
                     </pic:cNvPicPr>
                   </pic:nvPicPr>
                   <pic:blipFill>
-                    <a:blip r:embed="rId27"/>
+                    <a:blip r:embed="rId28"/>
                     <a:stretch>
                       <a:fillRect/>
                     </a:stretch>
@@ -3776,9 +3774,9 @@
         <w:t xml:space="preserve">core (sustained oscillation of an ATP-like cofactor). Tested against the published dynamics.</w:t>
       </w:r>
     </w:p>
-    <w:bookmarkEnd w:id="30"/>
     <w:bookmarkEnd w:id="31"/>
-    <w:bookmarkStart w:id="36" w:name="Xda4e20b13a6ccba0613190cd745101d4718570e"/>
+    <w:bookmarkEnd w:id="32"/>
+    <w:bookmarkStart w:id="37" w:name="Xda4e20b13a6ccba0613190cd745101d4718570e"/>
     <w:p>
       <w:pPr>
         <w:pStyle w:val="Heading4"/>
@@ -4157,7 +4155,7 @@
         <w:t xml:space="preserve">multicellular policy rejects every over-capacity configuration in the test suite by its admission threshold.</w:t>
       </w:r>
     </w:p>
-    <w:bookmarkStart w:id="35" w:name="fig:neg"/>
+    <w:bookmarkStart w:id="36" w:name="fig:neg"/>
     <w:p>
       <w:pPr>
         <w:pStyle w:val="CaptionedFigure"/>
@@ -4167,18 +4165,18 @@
           <wp:inline>
             <wp:extent cx="5334000" cy="2826919"/>
             <wp:effectExtent b="0" l="0" r="0" t="0"/>
-            <wp:docPr descr="" title="" id="33" name="Picture"/>
+            <wp:docPr descr="" title="" id="34" name="Picture"/>
             <a:graphic>
               <a:graphicData uri="http://schemas.openxmlformats.org/drawingml/2006/picture">
                 <pic:pic>
                   <pic:nvPicPr>
-                    <pic:cNvPr descr="figures/order_uq_negative.png" id="34" name="Picture"/>
+                    <pic:cNvPr descr="figures/order_uq_negative.png" id="35" name="Picture"/>
                     <pic:cNvPicPr>
                       <a:picLocks noChangeArrowheads="1" noChangeAspect="1"/>
                     </pic:cNvPicPr>
                   </pic:nvPicPr>
                   <pic:blipFill>
-                    <a:blip r:embed="rId32"/>
+                    <a:blip r:embed="rId33"/>
                     <a:stretch>
                       <a:fillRect/>
                     </a:stretch>
@@ -4319,10 +4317,10 @@
         <w:t xml:space="preserve">(2.31 vs 2.34), a paired difference that is not statistically significant. Shipped as a re-runnable test.</w:t>
       </w:r>
     </w:p>
-    <w:bookmarkEnd w:id="35"/>
     <w:bookmarkEnd w:id="36"/>
     <w:bookmarkEnd w:id="37"/>
-    <w:bookmarkStart w:id="38" w:name="impact"/>
+    <w:bookmarkEnd w:id="38"/>
+    <w:bookmarkStart w:id="39" w:name="impact"/>
     <w:p>
       <w:pPr>
         <w:pStyle w:val="Heading1"/>
@@ -4579,8 +4577,8 @@
         <w:t xml:space="preserve">separately.</w:t>
       </w:r>
     </w:p>
-    <w:bookmarkEnd w:id="38"/>
-    <w:bookmarkStart w:id="39" w:name="conclusions"/>
+    <w:bookmarkEnd w:id="39"/>
+    <w:bookmarkStart w:id="40" w:name="conclusions"/>
     <w:p>
       <w:pPr>
         <w:pStyle w:val="Heading1"/>
@@ -4692,8 +4690,8 @@
         <w:t xml:space="preserve">.</w:t>
       </w:r>
     </w:p>
-    <w:bookmarkEnd w:id="39"/>
-    <w:bookmarkStart w:id="44" w:name="declarations"/>
+    <w:bookmarkEnd w:id="40"/>
+    <w:bookmarkStart w:id="45" w:name="declarations"/>
     <w:p>
       <w:pPr>
         <w:pStyle w:val="Heading1"/>
@@ -4702,7 +4700,7 @@
         <w:t xml:space="preserve">Declarations</w:t>
       </w:r>
     </w:p>
-    <w:bookmarkStart w:id="40" w:name="code-and-data-availability."/>
+    <w:bookmarkStart w:id="41" w:name="code-and-data-availability."/>
     <w:p>
       <w:pPr>
         <w:pStyle w:val="Heading4"/>
@@ -4775,11 +4773,22 @@
         <w:t xml:space="preserve"> </w:t>
       </w:r>
       <w:r>
-        <w:t xml:space="preserve">release will be archived with a DOI on Zenodo upon posting.</w:t>
-      </w:r>
-    </w:p>
-    <w:bookmarkEnd w:id="40"/>
-    <w:bookmarkStart w:id="41" w:name="use-of-generative-ai."/>
+        <w:t xml:space="preserve">release is archived on Zenodo (</w:t>
+      </w:r>
+      <w:hyperlink r:id="rId12">
+        <w:r>
+          <w:rPr>
+            <w:rStyle w:val="Hyperlink"/>
+          </w:rPr>
+          <w:t xml:space="preserve">10.5281/zenodo.20805373</w:t>
+        </w:r>
+      </w:hyperlink>
+      <w:r>
+        <w:t xml:space="preserve">; concept DOI 10.5281/zenodo.20805372).</w:t>
+      </w:r>
+    </w:p>
+    <w:bookmarkEnd w:id="41"/>
+    <w:bookmarkStart w:id="42" w:name="use-of-generative-ai."/>
     <w:p>
       <w:pPr>
         <w:pStyle w:val="Heading4"/>
@@ -4808,8 +4817,8 @@
         <w:t xml:space="preserve">quantitative claim and citation, and reproduced all reported numbers from the released code.</w:t>
       </w:r>
     </w:p>
-    <w:bookmarkEnd w:id="41"/>
-    <w:bookmarkStart w:id="42" w:name="competing-interests."/>
+    <w:bookmarkEnd w:id="42"/>
+    <w:bookmarkStart w:id="43" w:name="competing-interests."/>
     <w:p>
       <w:pPr>
         <w:pStyle w:val="Heading4"/>
@@ -4826,8 +4835,8 @@
         <w:t xml:space="preserve">The author declares no competing interests.</w:t>
       </w:r>
     </w:p>
-    <w:bookmarkEnd w:id="42"/>
-    <w:bookmarkStart w:id="43" w:name="funding."/>
+    <w:bookmarkEnd w:id="43"/>
+    <w:bookmarkStart w:id="44" w:name="funding."/>
     <w:p>
       <w:pPr>
         <w:pStyle w:val="Heading4"/>
@@ -4850,9 +4859,9 @@
         <w:t xml:space="preserve">public, commercial, or not-for-profit sectors.</w:t>
       </w:r>
     </w:p>
-    <w:bookmarkEnd w:id="43"/>
     <w:bookmarkEnd w:id="44"/>
-    <w:bookmarkStart w:id="45" w:name="acknowledgements"/>
+    <w:bookmarkEnd w:id="45"/>
+    <w:bookmarkStart w:id="46" w:name="acknowledgements"/>
     <w:p>
       <w:pPr>
         <w:pStyle w:val="Heading1"/>
@@ -4875,8 +4884,8 @@
         <w:t xml:space="preserve">framework of Fangzhou Xiao, Jing Shuang Li, and John C. Doyle.</w:t>
       </w:r>
     </w:p>
-    <w:bookmarkEnd w:id="45"/>
-    <w:bookmarkStart w:id="109" w:name="references"/>
+    <w:bookmarkEnd w:id="46"/>
+    <w:bookmarkStart w:id="110" w:name="references"/>
     <w:p>
       <w:pPr>
         <w:pStyle w:val="Heading1"/>
@@ -4885,8 +4894,8 @@
         <w:t xml:space="preserve">References</w:t>
       </w:r>
     </w:p>
-    <w:bookmarkStart w:id="108" w:name="refs"/>
-    <w:bookmarkStart w:id="47" w:name="ref-orth2010fba"/>
+    <w:bookmarkStart w:id="109" w:name="refs"/>
+    <w:bookmarkStart w:id="48" w:name="ref-orth2010fba"/>
     <w:p>
       <w:pPr>
         <w:pStyle w:val="Bibliography"/>
@@ -4903,7 +4912,7 @@
       <w:r>
         <w:t xml:space="preserve">Orth, J. D., Thiele, I., and Palsson, B. Ø. What is flux balance analysis? Nature Biotechnology, 2010;28:245–248. doi:</w:t>
       </w:r>
-      <w:hyperlink r:id="rId46">
+      <w:hyperlink r:id="rId47">
         <w:r>
           <w:rPr>
             <w:rStyle w:val="Hyperlink"/>
@@ -4912,8 +4921,8 @@
         </w:r>
       </w:hyperlink>
     </w:p>
-    <w:bookmarkEnd w:id="47"/>
-    <w:bookmarkStart w:id="49" w:name="ref-varma1994stoichiometric"/>
+    <w:bookmarkEnd w:id="48"/>
+    <w:bookmarkStart w:id="50" w:name="ref-varma1994stoichiometric"/>
     <w:p>
       <w:pPr>
         <w:pStyle w:val="Bibliography"/>
@@ -4945,7 +4954,7 @@
       <w:r>
         <w:t xml:space="preserve">. Applied and Environmental Microbiology, 1994;60:3724–3731. doi:</w:t>
       </w:r>
-      <w:hyperlink r:id="rId48">
+      <w:hyperlink r:id="rId49">
         <w:r>
           <w:rPr>
             <w:rStyle w:val="Hyperlink"/>
@@ -4954,8 +4963,8 @@
         </w:r>
       </w:hyperlink>
     </w:p>
-    <w:bookmarkEnd w:id="49"/>
-    <w:bookmarkStart w:id="51" w:name="ref-saa2017kinetic"/>
+    <w:bookmarkEnd w:id="50"/>
+    <w:bookmarkStart w:id="52" w:name="ref-saa2017kinetic"/>
     <w:p>
       <w:pPr>
         <w:pStyle w:val="Bibliography"/>
@@ -4972,7 +4981,7 @@
       <w:r>
         <w:t xml:space="preserve">Saa, P. A., and Nielsen, L. K. Formulation, construction and analysis of kinetic models of metabolism: A review of modelling frameworks. Biotechnology Advances, 2017;35:981–1003. doi:</w:t>
       </w:r>
-      <w:hyperlink r:id="rId50">
+      <w:hyperlink r:id="rId51">
         <w:r>
           <w:rPr>
             <w:rStyle w:val="Hyperlink"/>
@@ -4981,8 +4990,8 @@
         </w:r>
       </w:hyperlink>
     </w:p>
-    <w:bookmarkEnd w:id="51"/>
-    <w:bookmarkStart w:id="53" w:name="ref-mahadevan2002dfba"/>
+    <w:bookmarkEnd w:id="52"/>
+    <w:bookmarkStart w:id="54" w:name="ref-mahadevan2002dfba"/>
     <w:p>
       <w:pPr>
         <w:pStyle w:val="Bibliography"/>
@@ -5008,7 +5017,7 @@
       <w:r>
         <w:t xml:space="preserve">. Biophysical Journal, 2002;83:1331–1340. doi:</w:t>
       </w:r>
-      <w:hyperlink r:id="rId52">
+      <w:hyperlink r:id="rId53">
         <w:r>
           <w:rPr>
             <w:rStyle w:val="Hyperlink"/>
@@ -5017,8 +5026,8 @@
         </w:r>
       </w:hyperlink>
     </w:p>
-    <w:bookmarkEnd w:id="53"/>
-    <w:bookmarkStart w:id="55" w:name="ref-hatzimanikatis1997loglinear"/>
+    <w:bookmarkEnd w:id="54"/>
+    <w:bookmarkStart w:id="56" w:name="ref-hatzimanikatis1997loglinear"/>
     <w:p>
       <w:pPr>
         <w:pStyle w:val="Bibliography"/>
@@ -5035,7 +5044,7 @@
       <w:r>
         <w:t xml:space="preserve">Hatzimanikatis, V., and Bailey, J. E. Effects of spatiotemporal variations on metabolic control: Approximate analysis using (log)linear kinetic models. Biotechnology and Bioengineering, 1997;54:91–104. doi:</w:t>
       </w:r>
-      <w:hyperlink r:id="rId54">
+      <w:hyperlink r:id="rId55">
         <w:r>
           <w:rPr>
             <w:rStyle w:val="Hyperlink"/>
@@ -5044,8 +5053,8 @@
         </w:r>
       </w:hyperlink>
     </w:p>
-    <w:bookmarkEnd w:id="55"/>
-    <w:bookmarkStart w:id="57" w:name="ref-visser2003linlog"/>
+    <w:bookmarkEnd w:id="56"/>
+    <w:bookmarkStart w:id="58" w:name="ref-visser2003linlog"/>
     <w:p>
       <w:pPr>
         <w:pStyle w:val="Bibliography"/>
@@ -5062,7 +5071,7 @@
       <w:r>
         <w:t xml:space="preserve">Visser, D., and Heijnen, J. J. Dynamic simulation and metabolic re-design of a branched pathway using linlog kinetics. Metabolic Engineering, 2003;5:164–176. doi:</w:t>
       </w:r>
-      <w:hyperlink r:id="rId56">
+      <w:hyperlink r:id="rId57">
         <w:r>
           <w:rPr>
             <w:rStyle w:val="Hyperlink"/>
@@ -5071,8 +5080,8 @@
         </w:r>
       </w:hyperlink>
     </w:p>
-    <w:bookmarkEnd w:id="57"/>
-    <w:bookmarkStart w:id="59" w:name="ref-miskovic2010oracle"/>
+    <w:bookmarkEnd w:id="58"/>
+    <w:bookmarkStart w:id="60" w:name="ref-miskovic2010oracle"/>
     <w:p>
       <w:pPr>
         <w:pStyle w:val="Bibliography"/>
@@ -5098,7 +5107,7 @@
       <w:r>
         <w:t xml:space="preserve">. Trends in Biotechnology, 2010;28:391–397. doi:</w:t>
       </w:r>
-      <w:hyperlink r:id="rId58">
+      <w:hyperlink r:id="rId59">
         <w:r>
           <w:rPr>
             <w:rStyle w:val="Hyperlink"/>
@@ -5107,8 +5116,8 @@
         </w:r>
       </w:hyperlink>
     </w:p>
-    <w:bookmarkEnd w:id="59"/>
-    <w:bookmarkStart w:id="61" w:name="ref-smallbone2007bridging"/>
+    <w:bookmarkEnd w:id="60"/>
+    <w:bookmarkStart w:id="62" w:name="ref-smallbone2007bridging"/>
     <w:p>
       <w:pPr>
         <w:pStyle w:val="Bibliography"/>
@@ -5125,7 +5134,7 @@
       <w:r>
         <w:t xml:space="preserve">Smallbone, K., Simeonidis, E., Broomhead, D. S., and Kell, D. B. Something from nothing: Bridging the gap between constraint-based and kinetic modelling. The FEBS Journal, 2007;274:5576–5585. doi:</w:t>
       </w:r>
-      <w:hyperlink r:id="rId60">
+      <w:hyperlink r:id="rId61">
         <w:r>
           <w:rPr>
             <w:rStyle w:val="Hyperlink"/>
@@ -5134,8 +5143,8 @@
         </w:r>
       </w:hyperlink>
     </w:p>
-    <w:bookmarkEnd w:id="61"/>
-    <w:bookmarkStart w:id="63" w:name="ref-xiao2023fec"/>
+    <w:bookmarkEnd w:id="62"/>
+    <w:bookmarkStart w:id="64" w:name="ref-xiao2023fec"/>
     <w:p>
       <w:pPr>
         <w:pStyle w:val="Bibliography"/>
@@ -5152,7 +5161,7 @@
       <w:r>
         <w:t xml:space="preserve">Xiao, F., Li, J. S., and Doyle, J. C. Flux exponent control predicts metabolic dynamics from network structure. 2023 american control conference (ACC), 2023;1189–1194. doi:</w:t>
       </w:r>
-      <w:hyperlink r:id="rId62">
+      <w:hyperlink r:id="rId63">
         <w:r>
           <w:rPr>
             <w:rStyle w:val="Hyperlink"/>
@@ -5161,8 +5170,8 @@
         </w:r>
       </w:hyperlink>
     </w:p>
-    <w:bookmarkEnd w:id="63"/>
-    <w:bookmarkStart w:id="65" w:name="ref-xiao2022thesis"/>
+    <w:bookmarkEnd w:id="64"/>
+    <w:bookmarkStart w:id="66" w:name="ref-xiao2022thesis"/>
     <w:p>
       <w:pPr>
         <w:pStyle w:val="Bibliography"/>
@@ -5179,7 +5188,7 @@
       <w:r>
         <w:t xml:space="preserve">Xiao, F. Biocontrol of biomolecular systems: Polyhedral constraints on binding’s regulation of catalysis from biocircuits to metabolism. California Institute of Technology, 2022. doi:</w:t>
       </w:r>
-      <w:hyperlink r:id="rId64">
+      <w:hyperlink r:id="rId65">
         <w:r>
           <w:rPr>
             <w:rStyle w:val="Hyperlink"/>
@@ -5188,8 +5197,8 @@
         </w:r>
       </w:hyperlink>
     </w:p>
-    <w:bookmarkEnd w:id="65"/>
-    <w:bookmarkStart w:id="67" w:name="ref-xiao2021structure"/>
+    <w:bookmarkEnd w:id="66"/>
+    <w:bookmarkStart w:id="68" w:name="ref-xiao2021structure"/>
     <w:p>
       <w:pPr>
         <w:pStyle w:val="Bibliography"/>
@@ -5206,7 +5215,7 @@
       <w:r>
         <w:t xml:space="preserve">Xiao, F., Khammash, M., and Doyle, J. C. Stability and control of biomolecular circuits through structure. 2021 american control conference (ACC), 2021;476–483. doi:</w:t>
       </w:r>
-      <w:hyperlink r:id="rId66">
+      <w:hyperlink r:id="rId67">
         <w:r>
           <w:rPr>
             <w:rStyle w:val="Hyperlink"/>
@@ -5215,8 +5224,8 @@
         </w:r>
       </w:hyperlink>
     </w:p>
-    <w:bookmarkEnd w:id="67"/>
-    <w:bookmarkStart w:id="69" w:name="ref-xiao2018rpa"/>
+    <w:bookmarkEnd w:id="68"/>
+    <w:bookmarkStart w:id="70" w:name="ref-xiao2018rpa"/>
     <w:p>
       <w:pPr>
         <w:pStyle w:val="Bibliography"/>
@@ -5233,7 +5242,7 @@
       <w:r>
         <w:t xml:space="preserve">Xiao, F., and Doyle, J. C. Robust perfect adaptation in biomolecular reaction networks. 2018 IEEE conference on decision and control (CDC), 2018;4345–4352. doi:</w:t>
       </w:r>
-      <w:hyperlink r:id="rId68">
+      <w:hyperlink r:id="rId69">
         <w:r>
           <w:rPr>
             <w:rStyle w:val="Hyperlink"/>
@@ -5242,8 +5251,8 @@
         </w:r>
       </w:hyperlink>
     </w:p>
-    <w:bookmarkEnd w:id="69"/>
-    <w:bookmarkStart w:id="70" w:name="ref-rawlings2017mpc"/>
+    <w:bookmarkEnd w:id="70"/>
+    <w:bookmarkStart w:id="71" w:name="ref-rawlings2017mpc"/>
     <w:p>
       <w:pPr>
         <w:pStyle w:val="Bibliography"/>
@@ -5264,8 +5273,8 @@
         <w:t xml:space="preserve"> </w:t>
       </w:r>
     </w:p>
-    <w:bookmarkEnd w:id="70"/>
-    <w:bookmarkStart w:id="72" w:name="ref-bemporad1999survey"/>
+    <w:bookmarkEnd w:id="71"/>
+    <w:bookmarkStart w:id="73" w:name="ref-bemporad1999survey"/>
     <w:p>
       <w:pPr>
         <w:pStyle w:val="Bibliography"/>
@@ -5282,7 +5291,7 @@
       <w:r>
         <w:t xml:space="preserve">Bemporad, A., and Morari, M. Robust model predictive control: A survey. Robustness in identification and control, 1999;245:207–226. doi:</w:t>
       </w:r>
-      <w:hyperlink r:id="rId71">
+      <w:hyperlink r:id="rId72">
         <w:r>
           <w:rPr>
             <w:rStyle w:val="Hyperlink"/>
@@ -5291,8 +5300,8 @@
         </w:r>
       </w:hyperlink>
     </w:p>
-    <w:bookmarkEnd w:id="72"/>
-    <w:bookmarkStart w:id="73" w:name="ref-paperA"/>
+    <w:bookmarkEnd w:id="73"/>
+    <w:bookmarkStart w:id="74" w:name="ref-paperA"/>
     <w:p>
       <w:pPr>
         <w:pStyle w:val="Bibliography"/>
@@ -5313,8 +5322,8 @@
         <w:t xml:space="preserve"> </w:t>
       </w:r>
     </w:p>
-    <w:bookmarkEnd w:id="73"/>
-    <w:bookmarkStart w:id="75" w:name="ref-savageau1969"/>
+    <w:bookmarkEnd w:id="74"/>
+    <w:bookmarkStart w:id="76" w:name="ref-savageau1969"/>
     <w:p>
       <w:pPr>
         <w:pStyle w:val="Bibliography"/>
@@ -5351,7 +5360,7 @@
       <w:r>
         <w:t xml:space="preserve">-pool system using a power-law approximation. Journal of Theoretical Biology, 1969;25:370–379. doi:</w:t>
       </w:r>
-      <w:hyperlink r:id="rId74">
+      <w:hyperlink r:id="rId75">
         <w:r>
           <w:rPr>
             <w:rStyle w:val="Hyperlink"/>
@@ -5360,8 +5369,8 @@
         </w:r>
       </w:hyperlink>
     </w:p>
-    <w:bookmarkEnd w:id="75"/>
-    <w:bookmarkStart w:id="77" w:name="ref-feinberg2019crnt"/>
+    <w:bookmarkEnd w:id="76"/>
+    <w:bookmarkStart w:id="78" w:name="ref-feinberg2019crnt"/>
     <w:p>
       <w:pPr>
         <w:pStyle w:val="Bibliography"/>
@@ -5378,7 +5387,7 @@
       <w:r>
         <w:t xml:space="preserve">Feinberg, M. Foundations of chemical reaction network theory. Springer, Cham, Switzerland, 2019. doi:</w:t>
       </w:r>
-      <w:hyperlink r:id="rId76">
+      <w:hyperlink r:id="rId77">
         <w:r>
           <w:rPr>
             <w:rStyle w:val="Hyperlink"/>
@@ -5387,8 +5396,8 @@
         </w:r>
       </w:hyperlink>
     </w:p>
-    <w:bookmarkEnd w:id="77"/>
-    <w:bookmarkStart w:id="78" w:name="ref-alon2019systems"/>
+    <w:bookmarkEnd w:id="78"/>
+    <w:bookmarkStart w:id="79" w:name="ref-alon2019systems"/>
     <w:p>
       <w:pPr>
         <w:pStyle w:val="Bibliography"/>
@@ -5409,8 +5418,8 @@
         <w:t xml:space="preserve"> </w:t>
       </w:r>
     </w:p>
-    <w:bookmarkEnd w:id="78"/>
-    <w:bookmarkStart w:id="79" w:name="ref-kacser1973control"/>
+    <w:bookmarkEnd w:id="79"/>
+    <w:bookmarkStart w:id="80" w:name="ref-kacser1973control"/>
     <w:p>
       <w:pPr>
         <w:pStyle w:val="Bibliography"/>
@@ -5431,8 +5440,8 @@
         <w:t xml:space="preserve"> </w:t>
       </w:r>
     </w:p>
-    <w:bookmarkEnd w:id="79"/>
-    <w:bookmarkStart w:id="81" w:name="ref-heinrich1974linear"/>
+    <w:bookmarkEnd w:id="80"/>
+    <w:bookmarkStart w:id="82" w:name="ref-heinrich1974linear"/>
     <w:p>
       <w:pPr>
         <w:pStyle w:val="Bibliography"/>
@@ -5449,7 +5458,7 @@
       <w:r>
         <w:t xml:space="preserve">Heinrich, R., and Rapoport, T. A. A linear steady-state treatment of enzymatic chains: General properties, control and effector strength. European Journal of Biochemistry, 1974;42:89–95. doi:</w:t>
       </w:r>
-      <w:hyperlink r:id="rId80">
+      <w:hyperlink r:id="rId81">
         <w:r>
           <w:rPr>
             <w:rStyle w:val="Hyperlink"/>
@@ -5458,8 +5467,8 @@
         </w:r>
       </w:hyperlink>
     </w:p>
-    <w:bookmarkEnd w:id="81"/>
-    <w:bookmarkStart w:id="82" w:name="ref-fell1997understanding"/>
+    <w:bookmarkEnd w:id="82"/>
+    <w:bookmarkStart w:id="83" w:name="ref-fell1997understanding"/>
     <w:p>
       <w:pPr>
         <w:pStyle w:val="Bibliography"/>
@@ -5480,8 +5489,8 @@
         <w:t xml:space="preserve"> </w:t>
       </w:r>
     </w:p>
-    <w:bookmarkEnd w:id="82"/>
-    <w:bookmarkStart w:id="84" w:name="ref-andersson2019casadi"/>
+    <w:bookmarkEnd w:id="83"/>
+    <w:bookmarkStart w:id="85" w:name="ref-andersson2019casadi"/>
     <w:p>
       <w:pPr>
         <w:pStyle w:val="Bibliography"/>
@@ -5510,7 +5519,7 @@
       <w:r>
         <w:t xml:space="preserve">– a software framework for nonlinear optimization and optimal control. Mathematical Programming Computation, 2019;11:1–36. doi:</w:t>
       </w:r>
-      <w:hyperlink r:id="rId83">
+      <w:hyperlink r:id="rId84">
         <w:r>
           <w:rPr>
             <w:rStyle w:val="Hyperlink"/>
@@ -5519,8 +5528,8 @@
         </w:r>
       </w:hyperlink>
     </w:p>
-    <w:bookmarkEnd w:id="84"/>
-    <w:bookmarkStart w:id="86" w:name="ref-wachter2006ipopt"/>
+    <w:bookmarkEnd w:id="85"/>
+    <w:bookmarkStart w:id="87" w:name="ref-wachter2006ipopt"/>
     <w:p>
       <w:pPr>
         <w:pStyle w:val="Bibliography"/>
@@ -5537,7 +5546,7 @@
       <w:r>
         <w:t xml:space="preserve">Wächter, A., and Biegler, L. T. On the implementation of an interior-point filter line-search algorithm for large-scale nonlinear programming. Mathematical Programming, 2006;106:25–57. doi:</w:t>
       </w:r>
-      <w:hyperlink r:id="rId85">
+      <w:hyperlink r:id="rId86">
         <w:r>
           <w:rPr>
             <w:rStyle w:val="Hyperlink"/>
@@ -5546,8 +5555,8 @@
         </w:r>
       </w:hyperlink>
     </w:p>
-    <w:bookmarkEnd w:id="86"/>
-    <w:bookmarkStart w:id="88" w:name="ref-kothare1996robust"/>
+    <w:bookmarkEnd w:id="87"/>
+    <w:bookmarkStart w:id="89" w:name="ref-kothare1996robust"/>
     <w:p>
       <w:pPr>
         <w:pStyle w:val="Bibliography"/>
@@ -5564,7 +5573,7 @@
       <w:r>
         <w:t xml:space="preserve">Kothare, M. V., Balakrishnan, V., and Morari, M. Robust constrained model predictive control using linear matrix inequalities. Automatica, 1996;32:1361–1379. doi:</w:t>
       </w:r>
-      <w:hyperlink r:id="rId87">
+      <w:hyperlink r:id="rId88">
         <w:r>
           <w:rPr>
             <w:rStyle w:val="Hyperlink"/>
@@ -5573,8 +5582,8 @@
         </w:r>
       </w:hyperlink>
     </w:p>
-    <w:bookmarkEnd w:id="88"/>
-    <w:bookmarkStart w:id="90" w:name="ref-scokaert1998minmax"/>
+    <w:bookmarkEnd w:id="89"/>
+    <w:bookmarkStart w:id="91" w:name="ref-scokaert1998minmax"/>
     <w:p>
       <w:pPr>
         <w:pStyle w:val="Bibliography"/>
@@ -5591,7 +5600,7 @@
       <w:r>
         <w:t xml:space="preserve">Scokaert, P. O. M., and Mayne, D. Q. Min-max feedback model predictive control for constrained linear systems. IEEE Transactions on Automatic Control, 1998;43:1136–1142. doi:</w:t>
       </w:r>
-      <w:hyperlink r:id="rId89">
+      <w:hyperlink r:id="rId90">
         <w:r>
           <w:rPr>
             <w:rStyle w:val="Hyperlink"/>
@@ -5600,8 +5609,8 @@
         </w:r>
       </w:hyperlink>
     </w:p>
-    <w:bookmarkEnd w:id="90"/>
-    <w:bookmarkStart w:id="92" w:name="ref-mayne2005tube"/>
+    <w:bookmarkEnd w:id="91"/>
+    <w:bookmarkStart w:id="93" w:name="ref-mayne2005tube"/>
     <w:p>
       <w:pPr>
         <w:pStyle w:val="Bibliography"/>
@@ -5618,7 +5627,7 @@
       <w:r>
         <w:t xml:space="preserve">Mayne, D. Q., Seron, M. M., and Raković, S. V. Robust model predictive control of constrained linear systems with bounded disturbances. Automatica, 2005;41:219–224. doi:</w:t>
       </w:r>
-      <w:hyperlink r:id="rId91">
+      <w:hyperlink r:id="rId92">
         <w:r>
           <w:rPr>
             <w:rStyle w:val="Hyperlink"/>
@@ -5627,8 +5636,8 @@
         </w:r>
       </w:hyperlink>
     </w:p>
-    <w:bookmarkEnd w:id="92"/>
-    <w:bookmarkStart w:id="94" w:name="ref-calafiore2006scenario"/>
+    <w:bookmarkEnd w:id="93"/>
+    <w:bookmarkStart w:id="95" w:name="ref-calafiore2006scenario"/>
     <w:p>
       <w:pPr>
         <w:pStyle w:val="Bibliography"/>
@@ -5645,7 +5654,7 @@
       <w:r>
         <w:t xml:space="preserve">Calafiore, G. C., and Campi, M. C. The scenario approach to robust control design. IEEE Transactions on Automatic Control, 2006;51:742–753. doi:</w:t>
       </w:r>
-      <w:hyperlink r:id="rId93">
+      <w:hyperlink r:id="rId94">
         <w:r>
           <w:rPr>
             <w:rStyle w:val="Hyperlink"/>
@@ -5654,8 +5663,8 @@
         </w:r>
       </w:hyperlink>
     </w:p>
-    <w:bookmarkEnd w:id="94"/>
-    <w:bookmarkStart w:id="96" w:name="ref-campi2008exact"/>
+    <w:bookmarkEnd w:id="95"/>
+    <w:bookmarkStart w:id="97" w:name="ref-campi2008exact"/>
     <w:p>
       <w:pPr>
         <w:pStyle w:val="Bibliography"/>
@@ -5672,7 +5681,7 @@
       <w:r>
         <w:t xml:space="preserve">Campi, M. C., and Garatti, S. The exact feasibility of randomized solutions of uncertain convex programs. SIAM Journal on Optimization, 2008;19:1211–1230. doi:</w:t>
       </w:r>
-      <w:hyperlink r:id="rId95">
+      <w:hyperlink r:id="rId96">
         <w:r>
           <w:rPr>
             <w:rStyle w:val="Hyperlink"/>
@@ -5681,8 +5690,8 @@
         </w:r>
       </w:hyperlink>
     </w:p>
-    <w:bookmarkEnd w:id="96"/>
-    <w:bookmarkStart w:id="98" w:name="ref-bertsimas2011robust"/>
+    <w:bookmarkEnd w:id="97"/>
+    <w:bookmarkStart w:id="99" w:name="ref-bertsimas2011robust"/>
     <w:p>
       <w:pPr>
         <w:pStyle w:val="Bibliography"/>
@@ -5699,7 +5708,7 @@
       <w:r>
         <w:t xml:space="preserve">Bertsimas, D., Brown, D. B., and Caramanis, C. Theory and applications of robust optimization. SIAM Review, 2011;53:464–501. doi:</w:t>
       </w:r>
-      <w:hyperlink r:id="rId97">
+      <w:hyperlink r:id="rId98">
         <w:r>
           <w:rPr>
             <w:rStyle w:val="Hyperlink"/>
@@ -5708,8 +5717,8 @@
         </w:r>
       </w:hyperlink>
     </w:p>
-    <w:bookmarkEnd w:id="98"/>
-    <w:bookmarkStart w:id="100" w:name="ref-selkov1968"/>
+    <w:bookmarkEnd w:id="99"/>
+    <w:bookmarkStart w:id="101" w:name="ref-selkov1968"/>
     <w:p>
       <w:pPr>
         <w:pStyle w:val="Bibliography"/>
@@ -5726,7 +5735,7 @@
       <w:r>
         <w:t xml:space="preserve">Sel’kov, E. E. Self-oscillations in glycolysis. 1. A simple kinetic model. European Journal of Biochemistry, 1968;4:79–86. doi:</w:t>
       </w:r>
-      <w:hyperlink r:id="rId99">
+      <w:hyperlink r:id="rId100">
         <w:r>
           <w:rPr>
             <w:rStyle w:val="Hyperlink"/>
@@ -5735,8 +5744,8 @@
         </w:r>
       </w:hyperlink>
     </w:p>
-    <w:bookmarkEnd w:id="100"/>
-    <w:bookmarkStart w:id="101" w:name="ref-strogatz2014nonlinear"/>
+    <w:bookmarkEnd w:id="101"/>
+    <w:bookmarkStart w:id="102" w:name="ref-strogatz2014nonlinear"/>
     <w:p>
       <w:pPr>
         <w:pStyle w:val="Bibliography"/>
@@ -5757,8 +5766,8 @@
         <w:t xml:space="preserve"> </w:t>
       </w:r>
     </w:p>
-    <w:bookmarkEnd w:id="101"/>
-    <w:bookmarkStart w:id="103" w:name="ref-wolf2000"/>
+    <w:bookmarkEnd w:id="102"/>
+    <w:bookmarkStart w:id="104" w:name="ref-wolf2000"/>
     <w:p>
       <w:pPr>
         <w:pStyle w:val="Bibliography"/>
@@ -5775,7 +5784,7 @@
       <w:r>
         <w:t xml:space="preserve">Wolf, J., and Heinrich, R. Effect of cellular interaction on glycolytic oscillations in yeast: A theoretical investigation. Biochemical Journal, 2000;345:321–334. doi:</w:t>
       </w:r>
-      <w:hyperlink r:id="rId102">
+      <w:hyperlink r:id="rId103">
         <w:r>
           <w:rPr>
             <w:rStyle w:val="Hyperlink"/>
@@ -5784,8 +5793,8 @@
         </w:r>
       </w:hyperlink>
     </w:p>
-    <w:bookmarkEnd w:id="103"/>
-    <w:bookmarkStart w:id="105" w:name="ref-biomd691"/>
+    <w:bookmarkEnd w:id="104"/>
+    <w:bookmarkStart w:id="106" w:name="ref-biomd691"/>
     <w:p>
       <w:pPr>
         <w:pStyle w:val="Bibliography"/>
@@ -5805,7 +5814,7 @@
       <w:r>
         <w:t xml:space="preserve"> </w:t>
       </w:r>
-      <w:hyperlink r:id="rId104">
+      <w:hyperlink r:id="rId105">
         <w:r>
           <w:rPr>
             <w:rStyle w:val="Hyperlink"/>
@@ -5814,8 +5823,8 @@
         </w:r>
       </w:hyperlink>
     </w:p>
-    <w:bookmarkEnd w:id="105"/>
-    <w:bookmarkStart w:id="107" w:name="ref-bental1998robust"/>
+    <w:bookmarkEnd w:id="106"/>
+    <w:bookmarkStart w:id="108" w:name="ref-bental1998robust"/>
     <w:p>
       <w:pPr>
         <w:pStyle w:val="Bibliography"/>
@@ -5832,7 +5841,7 @@
       <w:r>
         <w:t xml:space="preserve">Ben-Tal, A., and Nemirovski, A. Robust convex optimization. Mathematics of Operations Research, 1998;23:769–805. doi:</w:t>
       </w:r>
-      <w:hyperlink r:id="rId106">
+      <w:hyperlink r:id="rId107">
         <w:r>
           <w:rPr>
             <w:rStyle w:val="Hyperlink"/>
@@ -5841,9 +5850,9 @@
         </w:r>
       </w:hyperlink>
     </w:p>
-    <w:bookmarkEnd w:id="107"/>
     <w:bookmarkEnd w:id="108"/>
     <w:bookmarkEnd w:id="109"/>
+    <w:bookmarkEnd w:id="110"/>
     <w:sectPr>
       <w:footnotePr>
         <w:numRestart w:val="eachSect"/>

</xml_diff>